<commit_message>
Update report and presentation for live deployment and officer sign-up
</commit_message>
<xml_diff>
--- a/project_documentation/NEXORA_Project_Report.docx
+++ b/project_documentation/NEXORA_Project_Report.docx
@@ -12,7 +12,7 @@
           <w:noProof/>
         </w:rPr>
         <w:drawing>
-          <wp:inline distT="0" distB="0" distL="0" distR="0" wp14:anchorId="7DFD9AC5" wp14:editId="05277E4B">
+          <wp:inline distT="0" distB="0" distL="0" distR="0" wp14:anchorId="0221A91A" wp14:editId="60610A95">
             <wp:extent cx="3429000" cy="1171575"/>
             <wp:effectExtent l="0" t="0" r="0" b="0"/>
             <wp:docPr id="1" name="amrita_logo" descr="Official Amrita Vishwa Vidyapeetham logo" title="Amrita Vishwa Vidyapeetham logo"/>
@@ -395,7 +395,7 @@
       <w:pPr>
         <w:pStyle w:val="Heading1"/>
       </w:pPr>
-      <w:bookmarkStart w:id="0" w:name="_Toc243907493"/>
+      <w:bookmarkStart w:id="0" w:name="_Toc243949458"/>
       <w:r>
         <w:t>Project Description and Details</w:t>
       </w:r>
@@ -407,7 +407,7 @@
         <w:keepNext/>
         <w:spacing w:before="200"/>
       </w:pPr>
-      <w:bookmarkStart w:id="1" w:name="_Toc243907494"/>
+      <w:bookmarkStart w:id="1" w:name="_Toc243949459"/>
       <w:r>
         <w:t>Abstract</w:t>
       </w:r>
@@ -425,7 +425,7 @@
         <w:t xml:space="preserve">placement-readiness dashboard. A deterministic Career Action Engine combines these results into a short, ranked plan of next steps on the student home screen. Placement officers verify academic records, manage companies and drives, advance or reject applicants stage by stage, publish announcements and view aggregate analytics, including a privacy-preserving preparation-insights summary. The backend uses Firebase Authentication and Cloud Firestore on the free Spark plan; all privileged rules are enforced by </w:t>
       </w:r>
       <w:r>
-        <w:t>Firestore Security Rules, and Room provides offline access. The implementation is verified by 64 JVM unit tests (99.2% line coverage of the domain package), 47 Firestore Security Rules tests on the Firebase Emulator Suite and 6 instrumented tests on an Android 15 emulator.</w:t>
+        <w:t>Firestore Security Rules, and Room provides offline access. The application is deployed on a live Firebase project and was verified end to end with the officer portal on an Android emulator and the student portal on a physical phone. It is also verified by 65 JVM unit tests (99.2% line coverage of the domain package), 48 Firestore Security Rules tests on the Firebase Emulator Suite and 6 instrumented tests on an Android 15 emulator.</w:t>
       </w:r>
     </w:p>
     <w:p>
@@ -434,7 +434,7 @@
         <w:keepNext/>
         <w:spacing w:before="200"/>
       </w:pPr>
-      <w:bookmarkStart w:id="2" w:name="_Toc243907495"/>
+      <w:bookmarkStart w:id="2" w:name="_Toc243949460"/>
       <w:r>
         <w:t>Problem Statement</w:t>
       </w:r>
@@ -458,7 +458,7 @@
         <w:keepNext/>
         <w:spacing w:before="200"/>
       </w:pPr>
-      <w:bookmarkStart w:id="3" w:name="_Toc243907496"/>
+      <w:bookmarkStart w:id="3" w:name="_Toc243949461"/>
       <w:r>
         <w:t>Objectives</w:t>
       </w:r>
@@ -561,7 +561,7 @@
         <w:keepNext/>
         <w:spacing w:before="200"/>
       </w:pPr>
-      <w:bookmarkStart w:id="4" w:name="_Toc243907497"/>
+      <w:bookmarkStart w:id="4" w:name="_Toc243949462"/>
       <w:r>
         <w:t>Proposed Solution</w:t>
       </w:r>
@@ -585,7 +585,7 @@
         <w:keepNext/>
         <w:spacing w:before="200"/>
       </w:pPr>
-      <w:bookmarkStart w:id="5" w:name="_Toc243907498"/>
+      <w:bookmarkStart w:id="5" w:name="_Toc243949463"/>
       <w:r>
         <w:t>Target Users</w:t>
       </w:r>
@@ -628,7 +628,7 @@
         <w:t>Placement officers:</w:t>
       </w:r>
       <w:r>
-        <w:t xml:space="preserve"> staff of the placement office who verify records, run drives, decide outcomes and monitor progress. Officer accounts are provisioned by an administrator (seed script); the app never allows officer self-registration.</w:t>
+        <w:t xml:space="preserve"> staff of the placement office who verify records, run drives, decide outcomes and monitor progress. Officers create their account in the app by choosing “Placement officer” at sign-up (an open sign-up chosen for this academic project; see Section 4.5).</w:t>
       </w:r>
     </w:p>
     <w:p>
@@ -637,7 +637,7 @@
         <w:keepNext/>
         <w:spacing w:before="200"/>
       </w:pPr>
-      <w:bookmarkStart w:id="6" w:name="_Toc243907499"/>
+      <w:bookmarkStart w:id="6" w:name="_Toc243949464"/>
       <w:r>
         <w:t>Technology Stack</w:t>
       </w:r>
@@ -1192,7 +1192,7 @@
         <w:keepNext/>
         <w:spacing w:before="200"/>
       </w:pPr>
-      <w:bookmarkStart w:id="7" w:name="_Toc243907500"/>
+      <w:bookmarkStart w:id="7" w:name="_Toc243949465"/>
       <w:r>
         <w:t>System Architecture</w:t>
       </w:r>
@@ -1213,7 +1213,7 @@
         <w:keepNext/>
         <w:spacing w:before="200"/>
       </w:pPr>
-      <w:bookmarkStart w:id="8" w:name="_Toc243907501"/>
+      <w:bookmarkStart w:id="8" w:name="_Toc243949466"/>
       <w:r>
         <w:t>Project Scope</w:t>
       </w:r>
@@ -1238,7 +1238,7 @@
         <w:spacing w:after="60" w:line="288" w:lineRule="auto"/>
       </w:pPr>
       <w:r>
-        <w:t>Student and officer portals, onboarding, registration (student only), login, logout and password reset.</w:t>
+        <w:t>Student and officer portals, onboarding, registration as a student or placement officer, login, logout and password reset.</w:t>
       </w:r>
     </w:p>
     <w:p>
@@ -1277,7 +1277,7 @@
         <w:spacing w:after="60" w:line="288" w:lineRule="auto"/>
       </w:pPr>
       <w:r>
-        <w:t>Readiness tracking, Career Action Engine, announcements, local notifications, officer analytics and preparation insights.</w:t>
+        <w:t>Readiness tracking, Career Action Engine, announcements, automatic new-drive notifications, local notifications, officer analytics and preparation insights.</w:t>
       </w:r>
     </w:p>
     <w:p>
@@ -1321,7 +1321,7 @@
     <w:sdt>
       <w:sdtPr>
         <w:alias w:val="Table of Contents"/>
-        <w:id w:val="-1741855954"/>
+        <w:id w:val="-933426967"/>
       </w:sdtPr>
       <w:sdtEndPr/>
       <w:sdtContent>
@@ -1347,7 +1347,7 @@
           <w:r>
             <w:fldChar w:fldCharType="separate"/>
           </w:r>
-          <w:hyperlink w:anchor="_Toc243907493" w:history="1">
+          <w:hyperlink w:anchor="_Toc243949458" w:history="1">
             <w:r>
               <w:rPr>
                 <w:rStyle w:val="Hyperlink"/>
@@ -1371,7 +1371,7 @@
               <w:rPr>
                 <w:noProof/>
               </w:rPr>
-              <w:instrText xml:space="preserve"> PAGEREF _Toc243907493 \h </w:instrText>
+              <w:instrText xml:space="preserve"> PAGEREF _Toc243949458 \h </w:instrText>
             </w:r>
             <w:r>
               <w:rPr>
@@ -1411,7 +1411,7 @@
               <w14:ligatures w14:val="standardContextual"/>
             </w:rPr>
           </w:pPr>
-          <w:hyperlink w:anchor="_Toc243907494" w:history="1">
+          <w:hyperlink w:anchor="_Toc243949459" w:history="1">
             <w:r>
               <w:rPr>
                 <w:rStyle w:val="Hyperlink"/>
@@ -1435,7 +1435,7 @@
               <w:rPr>
                 <w:noProof/>
               </w:rPr>
-              <w:instrText xml:space="preserve"> PAGEREF _Toc243907494 \h </w:instrText>
+              <w:instrText xml:space="preserve"> PAGEREF _Toc243949459 \h </w:instrText>
             </w:r>
             <w:r>
               <w:rPr>
@@ -1475,7 +1475,7 @@
               <w14:ligatures w14:val="standardContextual"/>
             </w:rPr>
           </w:pPr>
-          <w:hyperlink w:anchor="_Toc243907495" w:history="1">
+          <w:hyperlink w:anchor="_Toc243949460" w:history="1">
             <w:r>
               <w:rPr>
                 <w:rStyle w:val="Hyperlink"/>
@@ -1499,7 +1499,7 @@
               <w:rPr>
                 <w:noProof/>
               </w:rPr>
-              <w:instrText xml:space="preserve"> PAGEREF _Toc243907495 \h </w:instrText>
+              <w:instrText xml:space="preserve"> PAGEREF _Toc243949460 \h </w:instrText>
             </w:r>
             <w:r>
               <w:rPr>
@@ -1539,7 +1539,7 @@
               <w14:ligatures w14:val="standardContextual"/>
             </w:rPr>
           </w:pPr>
-          <w:hyperlink w:anchor="_Toc243907496" w:history="1">
+          <w:hyperlink w:anchor="_Toc243949461" w:history="1">
             <w:r>
               <w:rPr>
                 <w:rStyle w:val="Hyperlink"/>
@@ -1563,7 +1563,7 @@
               <w:rPr>
                 <w:noProof/>
               </w:rPr>
-              <w:instrText xml:space="preserve"> PAGEREF _Toc243907496 \h </w:instrText>
+              <w:instrText xml:space="preserve"> PAGEREF _Toc243949461 \h </w:instrText>
             </w:r>
             <w:r>
               <w:rPr>
@@ -1603,7 +1603,7 @@
               <w14:ligatures w14:val="standardContextual"/>
             </w:rPr>
           </w:pPr>
-          <w:hyperlink w:anchor="_Toc243907497" w:history="1">
+          <w:hyperlink w:anchor="_Toc243949462" w:history="1">
             <w:r>
               <w:rPr>
                 <w:rStyle w:val="Hyperlink"/>
@@ -1627,7 +1627,7 @@
               <w:rPr>
                 <w:noProof/>
               </w:rPr>
-              <w:instrText xml:space="preserve"> PAGEREF _Toc243907497 \h </w:instrText>
+              <w:instrText xml:space="preserve"> PAGEREF _Toc243949462 \h </w:instrText>
             </w:r>
             <w:r>
               <w:rPr>
@@ -1667,7 +1667,7 @@
               <w14:ligatures w14:val="standardContextual"/>
             </w:rPr>
           </w:pPr>
-          <w:hyperlink w:anchor="_Toc243907498" w:history="1">
+          <w:hyperlink w:anchor="_Toc243949463" w:history="1">
             <w:r>
               <w:rPr>
                 <w:rStyle w:val="Hyperlink"/>
@@ -1691,7 +1691,7 @@
               <w:rPr>
                 <w:noProof/>
               </w:rPr>
-              <w:instrText xml:space="preserve"> PAGEREF _Toc243907498 \h </w:instrText>
+              <w:instrText xml:space="preserve"> PAGEREF _Toc243949463 \h </w:instrText>
             </w:r>
             <w:r>
               <w:rPr>
@@ -1731,7 +1731,7 @@
               <w14:ligatures w14:val="standardContextual"/>
             </w:rPr>
           </w:pPr>
-          <w:hyperlink w:anchor="_Toc243907499" w:history="1">
+          <w:hyperlink w:anchor="_Toc243949464" w:history="1">
             <w:r>
               <w:rPr>
                 <w:rStyle w:val="Hyperlink"/>
@@ -1755,7 +1755,7 @@
               <w:rPr>
                 <w:noProof/>
               </w:rPr>
-              <w:instrText xml:space="preserve"> PAGEREF _Toc243907499 \h </w:instrText>
+              <w:instrText xml:space="preserve"> PAGEREF _Toc243949464 \h </w:instrText>
             </w:r>
             <w:r>
               <w:rPr>
@@ -1795,7 +1795,7 @@
               <w14:ligatures w14:val="standardContextual"/>
             </w:rPr>
           </w:pPr>
-          <w:hyperlink w:anchor="_Toc243907500" w:history="1">
+          <w:hyperlink w:anchor="_Toc243949465" w:history="1">
             <w:r>
               <w:rPr>
                 <w:rStyle w:val="Hyperlink"/>
@@ -1819,7 +1819,7 @@
               <w:rPr>
                 <w:noProof/>
               </w:rPr>
-              <w:instrText xml:space="preserve"> PAGEREF _Toc243907500 \h </w:instrText>
+              <w:instrText xml:space="preserve"> PAGEREF _Toc243949465 \h </w:instrText>
             </w:r>
             <w:r>
               <w:rPr>
@@ -1836,7 +1836,7 @@
               <w:rPr>
                 <w:noProof/>
               </w:rPr>
-              <w:t>3</w:t>
+              <w:t>4</w:t>
             </w:r>
             <w:r>
               <w:rPr>
@@ -1859,7 +1859,7 @@
               <w14:ligatures w14:val="standardContextual"/>
             </w:rPr>
           </w:pPr>
-          <w:hyperlink w:anchor="_Toc243907501" w:history="1">
+          <w:hyperlink w:anchor="_Toc243949466" w:history="1">
             <w:r>
               <w:rPr>
                 <w:rStyle w:val="Hyperlink"/>
@@ -1883,7 +1883,7 @@
               <w:rPr>
                 <w:noProof/>
               </w:rPr>
-              <w:instrText xml:space="preserve"> PAGEREF _Toc243907501 \h </w:instrText>
+              <w:instrText xml:space="preserve"> PAGEREF _Toc243949466 \h </w:instrText>
             </w:r>
             <w:r>
               <w:rPr>
@@ -1923,7 +1923,7 @@
               <w14:ligatures w14:val="standardContextual"/>
             </w:rPr>
           </w:pPr>
-          <w:hyperlink w:anchor="_Toc243907502" w:history="1">
+          <w:hyperlink w:anchor="_Toc243949467" w:history="1">
             <w:r>
               <w:rPr>
                 <w:rStyle w:val="Hyperlink"/>
@@ -1947,7 +1947,7 @@
               <w:rPr>
                 <w:noProof/>
               </w:rPr>
-              <w:instrText xml:space="preserve"> PAGEREF _Toc243907502 \h </w:instrText>
+              <w:instrText xml:space="preserve"> PAGEREF _Toc243949467 \h </w:instrText>
             </w:r>
             <w:r>
               <w:rPr>
@@ -1987,7 +1987,7 @@
               <w14:ligatures w14:val="standardContextual"/>
             </w:rPr>
           </w:pPr>
-          <w:hyperlink w:anchor="_Toc243907503" w:history="1">
+          <w:hyperlink w:anchor="_Toc243949468" w:history="1">
             <w:r>
               <w:rPr>
                 <w:rStyle w:val="Hyperlink"/>
@@ -2011,7 +2011,7 @@
               <w:rPr>
                 <w:noProof/>
               </w:rPr>
-              <w:instrText xml:space="preserve"> PAGEREF _Toc243907503 \h </w:instrText>
+              <w:instrText xml:space="preserve"> PAGEREF _Toc243949468 \h </w:instrText>
             </w:r>
             <w:r>
               <w:rPr>
@@ -2051,7 +2051,7 @@
               <w14:ligatures w14:val="standardContextual"/>
             </w:rPr>
           </w:pPr>
-          <w:hyperlink w:anchor="_Toc243907504" w:history="1">
+          <w:hyperlink w:anchor="_Toc243949469" w:history="1">
             <w:r>
               <w:rPr>
                 <w:rStyle w:val="Hyperlink"/>
@@ -2075,7 +2075,7 @@
               <w:rPr>
                 <w:noProof/>
               </w:rPr>
-              <w:instrText xml:space="preserve"> PAGEREF _Toc243907504 \h </w:instrText>
+              <w:instrText xml:space="preserve"> PAGEREF _Toc243949469 \h </w:instrText>
             </w:r>
             <w:r>
               <w:rPr>
@@ -2115,7 +2115,7 @@
               <w14:ligatures w14:val="standardContextual"/>
             </w:rPr>
           </w:pPr>
-          <w:hyperlink w:anchor="_Toc243907505" w:history="1">
+          <w:hyperlink w:anchor="_Toc243949470" w:history="1">
             <w:r>
               <w:rPr>
                 <w:rStyle w:val="Hyperlink"/>
@@ -2139,7 +2139,7 @@
               <w:rPr>
                 <w:noProof/>
               </w:rPr>
-              <w:instrText xml:space="preserve"> PAGEREF _Toc243907505 \h </w:instrText>
+              <w:instrText xml:space="preserve"> PAGEREF _Toc243949470 \h </w:instrText>
             </w:r>
             <w:r>
               <w:rPr>
@@ -2179,7 +2179,7 @@
               <w14:ligatures w14:val="standardContextual"/>
             </w:rPr>
           </w:pPr>
-          <w:hyperlink w:anchor="_Toc243907506" w:history="1">
+          <w:hyperlink w:anchor="_Toc243949471" w:history="1">
             <w:r>
               <w:rPr>
                 <w:rStyle w:val="Hyperlink"/>
@@ -2203,7 +2203,7 @@
               <w:rPr>
                 <w:noProof/>
               </w:rPr>
-              <w:instrText xml:space="preserve"> PAGEREF _Toc243907506 \h </w:instrText>
+              <w:instrText xml:space="preserve"> PAGEREF _Toc243949471 \h </w:instrText>
             </w:r>
             <w:r>
               <w:rPr>
@@ -2243,7 +2243,7 @@
               <w14:ligatures w14:val="standardContextual"/>
             </w:rPr>
           </w:pPr>
-          <w:hyperlink w:anchor="_Toc243907507" w:history="1">
+          <w:hyperlink w:anchor="_Toc243949472" w:history="1">
             <w:r>
               <w:rPr>
                 <w:rStyle w:val="Hyperlink"/>
@@ -2267,7 +2267,7 @@
               <w:rPr>
                 <w:noProof/>
               </w:rPr>
-              <w:instrText xml:space="preserve"> PAGEREF _Toc243907507 \h </w:instrText>
+              <w:instrText xml:space="preserve"> PAGEREF _Toc243949472 \h </w:instrText>
             </w:r>
             <w:r>
               <w:rPr>
@@ -2307,7 +2307,7 @@
               <w14:ligatures w14:val="standardContextual"/>
             </w:rPr>
           </w:pPr>
-          <w:hyperlink w:anchor="_Toc243907508" w:history="1">
+          <w:hyperlink w:anchor="_Toc243949473" w:history="1">
             <w:r>
               <w:rPr>
                 <w:rStyle w:val="Hyperlink"/>
@@ -2331,7 +2331,7 @@
               <w:rPr>
                 <w:noProof/>
               </w:rPr>
-              <w:instrText xml:space="preserve"> PAGEREF _Toc243907508 \h </w:instrText>
+              <w:instrText xml:space="preserve"> PAGEREF _Toc243949473 \h </w:instrText>
             </w:r>
             <w:r>
               <w:rPr>
@@ -2371,7 +2371,7 @@
               <w14:ligatures w14:val="standardContextual"/>
             </w:rPr>
           </w:pPr>
-          <w:hyperlink w:anchor="_Toc243907509" w:history="1">
+          <w:hyperlink w:anchor="_Toc243949474" w:history="1">
             <w:r>
               <w:rPr>
                 <w:rStyle w:val="Hyperlink"/>
@@ -2395,7 +2395,7 @@
               <w:rPr>
                 <w:noProof/>
               </w:rPr>
-              <w:instrText xml:space="preserve"> PAGEREF _Toc243907509 \h </w:instrText>
+              <w:instrText xml:space="preserve"> PAGEREF _Toc243949474 \h </w:instrText>
             </w:r>
             <w:r>
               <w:rPr>
@@ -2435,7 +2435,7 @@
               <w14:ligatures w14:val="standardContextual"/>
             </w:rPr>
           </w:pPr>
-          <w:hyperlink w:anchor="_Toc243907510" w:history="1">
+          <w:hyperlink w:anchor="_Toc243949475" w:history="1">
             <w:r>
               <w:rPr>
                 <w:rStyle w:val="Hyperlink"/>
@@ -2459,7 +2459,7 @@
               <w:rPr>
                 <w:noProof/>
               </w:rPr>
-              <w:instrText xml:space="preserve"> PAGEREF _Toc243907510 \h </w:instrText>
+              <w:instrText xml:space="preserve"> PAGEREF _Toc243949475 \h </w:instrText>
             </w:r>
             <w:r>
               <w:rPr>
@@ -2499,7 +2499,7 @@
               <w14:ligatures w14:val="standardContextual"/>
             </w:rPr>
           </w:pPr>
-          <w:hyperlink w:anchor="_Toc243907511" w:history="1">
+          <w:hyperlink w:anchor="_Toc243949476" w:history="1">
             <w:r>
               <w:rPr>
                 <w:rStyle w:val="Hyperlink"/>
@@ -2523,7 +2523,7 @@
               <w:rPr>
                 <w:noProof/>
               </w:rPr>
-              <w:instrText xml:space="preserve"> PAGEREF _Toc243907511 \h </w:instrText>
+              <w:instrText xml:space="preserve"> PAGEREF _Toc243949476 \h </w:instrText>
             </w:r>
             <w:r>
               <w:rPr>
@@ -2563,7 +2563,7 @@
               <w14:ligatures w14:val="standardContextual"/>
             </w:rPr>
           </w:pPr>
-          <w:hyperlink w:anchor="_Toc243907512" w:history="1">
+          <w:hyperlink w:anchor="_Toc243949477" w:history="1">
             <w:r>
               <w:rPr>
                 <w:rStyle w:val="Hyperlink"/>
@@ -2587,7 +2587,7 @@
               <w:rPr>
                 <w:noProof/>
               </w:rPr>
-              <w:instrText xml:space="preserve"> PAGEREF _Toc243907512 \h </w:instrText>
+              <w:instrText xml:space="preserve"> PAGEREF _Toc243949477 \h </w:instrText>
             </w:r>
             <w:r>
               <w:rPr>
@@ -2604,7 +2604,7 @@
               <w:rPr>
                 <w:noProof/>
               </w:rPr>
-              <w:t>10</w:t>
+              <w:t>11</w:t>
             </w:r>
             <w:r>
               <w:rPr>
@@ -2627,7 +2627,7 @@
               <w14:ligatures w14:val="standardContextual"/>
             </w:rPr>
           </w:pPr>
-          <w:hyperlink w:anchor="_Toc243907513" w:history="1">
+          <w:hyperlink w:anchor="_Toc243949478" w:history="1">
             <w:r>
               <w:rPr>
                 <w:rStyle w:val="Hyperlink"/>
@@ -2651,7 +2651,7 @@
               <w:rPr>
                 <w:noProof/>
               </w:rPr>
-              <w:instrText xml:space="preserve"> PAGEREF _Toc243907513 \h </w:instrText>
+              <w:instrText xml:space="preserve"> PAGEREF _Toc243949478 \h </w:instrText>
             </w:r>
             <w:r>
               <w:rPr>
@@ -2668,7 +2668,7 @@
               <w:rPr>
                 <w:noProof/>
               </w:rPr>
-              <w:t>11</w:t>
+              <w:t>12</w:t>
             </w:r>
             <w:r>
               <w:rPr>
@@ -2691,7 +2691,7 @@
               <w14:ligatures w14:val="standardContextual"/>
             </w:rPr>
           </w:pPr>
-          <w:hyperlink w:anchor="_Toc243907514" w:history="1">
+          <w:hyperlink w:anchor="_Toc243949479" w:history="1">
             <w:r>
               <w:rPr>
                 <w:rStyle w:val="Hyperlink"/>
@@ -2715,7 +2715,7 @@
               <w:rPr>
                 <w:noProof/>
               </w:rPr>
-              <w:instrText xml:space="preserve"> PAGEREF _Toc243907514 \h </w:instrText>
+              <w:instrText xml:space="preserve"> PAGEREF _Toc243949479 \h </w:instrText>
             </w:r>
             <w:r>
               <w:rPr>
@@ -2732,7 +2732,7 @@
               <w:rPr>
                 <w:noProof/>
               </w:rPr>
-              <w:t>11</w:t>
+              <w:t>12</w:t>
             </w:r>
             <w:r>
               <w:rPr>
@@ -2755,7 +2755,7 @@
               <w14:ligatures w14:val="standardContextual"/>
             </w:rPr>
           </w:pPr>
-          <w:hyperlink w:anchor="_Toc243907515" w:history="1">
+          <w:hyperlink w:anchor="_Toc243949480" w:history="1">
             <w:r>
               <w:rPr>
                 <w:rStyle w:val="Hyperlink"/>
@@ -2779,7 +2779,7 @@
               <w:rPr>
                 <w:noProof/>
               </w:rPr>
-              <w:instrText xml:space="preserve"> PAGEREF _Toc243907515 \h </w:instrText>
+              <w:instrText xml:space="preserve"> PAGEREF _Toc243949480 \h </w:instrText>
             </w:r>
             <w:r>
               <w:rPr>
@@ -2796,7 +2796,7 @@
               <w:rPr>
                 <w:noProof/>
               </w:rPr>
-              <w:t>12</w:t>
+              <w:t>13</w:t>
             </w:r>
             <w:r>
               <w:rPr>
@@ -2819,7 +2819,7 @@
               <w14:ligatures w14:val="standardContextual"/>
             </w:rPr>
           </w:pPr>
-          <w:hyperlink w:anchor="_Toc243907516" w:history="1">
+          <w:hyperlink w:anchor="_Toc243949481" w:history="1">
             <w:r>
               <w:rPr>
                 <w:rStyle w:val="Hyperlink"/>
@@ -2843,7 +2843,7 @@
               <w:rPr>
                 <w:noProof/>
               </w:rPr>
-              <w:instrText xml:space="preserve"> PAGEREF _Toc243907516 \h </w:instrText>
+              <w:instrText xml:space="preserve"> PAGEREF _Toc243949481 \h </w:instrText>
             </w:r>
             <w:r>
               <w:rPr>
@@ -2860,7 +2860,7 @@
               <w:rPr>
                 <w:noProof/>
               </w:rPr>
-              <w:t>13</w:t>
+              <w:t>14</w:t>
             </w:r>
             <w:r>
               <w:rPr>
@@ -2883,7 +2883,7 @@
               <w14:ligatures w14:val="standardContextual"/>
             </w:rPr>
           </w:pPr>
-          <w:hyperlink w:anchor="_Toc243907517" w:history="1">
+          <w:hyperlink w:anchor="_Toc243949482" w:history="1">
             <w:r>
               <w:rPr>
                 <w:rStyle w:val="Hyperlink"/>
@@ -2907,7 +2907,7 @@
               <w:rPr>
                 <w:noProof/>
               </w:rPr>
-              <w:instrText xml:space="preserve"> PAGEREF _Toc243907517 \h </w:instrText>
+              <w:instrText xml:space="preserve"> PAGEREF _Toc243949482 \h </w:instrText>
             </w:r>
             <w:r>
               <w:rPr>
@@ -2924,7 +2924,7 @@
               <w:rPr>
                 <w:noProof/>
               </w:rPr>
-              <w:t>14</w:t>
+              <w:t>15</w:t>
             </w:r>
             <w:r>
               <w:rPr>
@@ -2947,7 +2947,7 @@
               <w14:ligatures w14:val="standardContextual"/>
             </w:rPr>
           </w:pPr>
-          <w:hyperlink w:anchor="_Toc243907518" w:history="1">
+          <w:hyperlink w:anchor="_Toc243949483" w:history="1">
             <w:r>
               <w:rPr>
                 <w:rStyle w:val="Hyperlink"/>
@@ -2971,7 +2971,7 @@
               <w:rPr>
                 <w:noProof/>
               </w:rPr>
-              <w:instrText xml:space="preserve"> PAGEREF _Toc243907518 \h </w:instrText>
+              <w:instrText xml:space="preserve"> PAGEREF _Toc243949483 \h </w:instrText>
             </w:r>
             <w:r>
               <w:rPr>
@@ -2988,7 +2988,7 @@
               <w:rPr>
                 <w:noProof/>
               </w:rPr>
-              <w:t>15</w:t>
+              <w:t>16</w:t>
             </w:r>
             <w:r>
               <w:rPr>
@@ -3011,7 +3011,7 @@
               <w14:ligatures w14:val="standardContextual"/>
             </w:rPr>
           </w:pPr>
-          <w:hyperlink w:anchor="_Toc243907519" w:history="1">
+          <w:hyperlink w:anchor="_Toc243949484" w:history="1">
             <w:r>
               <w:rPr>
                 <w:rStyle w:val="Hyperlink"/>
@@ -3035,7 +3035,7 @@
               <w:rPr>
                 <w:noProof/>
               </w:rPr>
-              <w:instrText xml:space="preserve"> PAGEREF _Toc243907519 \h </w:instrText>
+              <w:instrText xml:space="preserve"> PAGEREF _Toc243949484 \h </w:instrText>
             </w:r>
             <w:r>
               <w:rPr>
@@ -3052,7 +3052,7 @@
               <w:rPr>
                 <w:noProof/>
               </w:rPr>
-              <w:t>16</w:t>
+              <w:t>17</w:t>
             </w:r>
             <w:r>
               <w:rPr>
@@ -3075,7 +3075,7 @@
               <w14:ligatures w14:val="standardContextual"/>
             </w:rPr>
           </w:pPr>
-          <w:hyperlink w:anchor="_Toc243907520" w:history="1">
+          <w:hyperlink w:anchor="_Toc243949485" w:history="1">
             <w:r>
               <w:rPr>
                 <w:rStyle w:val="Hyperlink"/>
@@ -3099,7 +3099,7 @@
               <w:rPr>
                 <w:noProof/>
               </w:rPr>
-              <w:instrText xml:space="preserve"> PAGEREF _Toc243907520 \h </w:instrText>
+              <w:instrText xml:space="preserve"> PAGEREF _Toc243949485 \h </w:instrText>
             </w:r>
             <w:r>
               <w:rPr>
@@ -3116,7 +3116,7 @@
               <w:rPr>
                 <w:noProof/>
               </w:rPr>
-              <w:t>17</w:t>
+              <w:t>18</w:t>
             </w:r>
             <w:r>
               <w:rPr>
@@ -3139,7 +3139,7 @@
               <w14:ligatures w14:val="standardContextual"/>
             </w:rPr>
           </w:pPr>
-          <w:hyperlink w:anchor="_Toc243907521" w:history="1">
+          <w:hyperlink w:anchor="_Toc243949486" w:history="1">
             <w:r>
               <w:rPr>
                 <w:rStyle w:val="Hyperlink"/>
@@ -3163,7 +3163,7 @@
               <w:rPr>
                 <w:noProof/>
               </w:rPr>
-              <w:instrText xml:space="preserve"> PAGEREF _Toc243907521 \h </w:instrText>
+              <w:instrText xml:space="preserve"> PAGEREF _Toc243949486 \h </w:instrText>
             </w:r>
             <w:r>
               <w:rPr>
@@ -3180,7 +3180,7 @@
               <w:rPr>
                 <w:noProof/>
               </w:rPr>
-              <w:t>18</w:t>
+              <w:t>19</w:t>
             </w:r>
             <w:r>
               <w:rPr>
@@ -3203,7 +3203,7 @@
               <w14:ligatures w14:val="standardContextual"/>
             </w:rPr>
           </w:pPr>
-          <w:hyperlink w:anchor="_Toc243907522" w:history="1">
+          <w:hyperlink w:anchor="_Toc243949487" w:history="1">
             <w:r>
               <w:rPr>
                 <w:rStyle w:val="Hyperlink"/>
@@ -3227,7 +3227,7 @@
               <w:rPr>
                 <w:noProof/>
               </w:rPr>
-              <w:instrText xml:space="preserve"> PAGEREF _Toc243907522 \h </w:instrText>
+              <w:instrText xml:space="preserve"> PAGEREF _Toc243949487 \h </w:instrText>
             </w:r>
             <w:r>
               <w:rPr>
@@ -3244,7 +3244,7 @@
               <w:rPr>
                 <w:noProof/>
               </w:rPr>
-              <w:t>18</w:t>
+              <w:t>19</w:t>
             </w:r>
             <w:r>
               <w:rPr>
@@ -3267,7 +3267,7 @@
               <w14:ligatures w14:val="standardContextual"/>
             </w:rPr>
           </w:pPr>
-          <w:hyperlink w:anchor="_Toc243907523" w:history="1">
+          <w:hyperlink w:anchor="_Toc243949488" w:history="1">
             <w:r>
               <w:rPr>
                 <w:rStyle w:val="Hyperlink"/>
@@ -3291,7 +3291,7 @@
               <w:rPr>
                 <w:noProof/>
               </w:rPr>
-              <w:instrText xml:space="preserve"> PAGEREF _Toc243907523 \h </w:instrText>
+              <w:instrText xml:space="preserve"> PAGEREF _Toc243949488 \h </w:instrText>
             </w:r>
             <w:r>
               <w:rPr>
@@ -3308,7 +3308,7 @@
               <w:rPr>
                 <w:noProof/>
               </w:rPr>
-              <w:t>18</w:t>
+              <w:t>19</w:t>
             </w:r>
             <w:r>
               <w:rPr>
@@ -3331,7 +3331,7 @@
               <w14:ligatures w14:val="standardContextual"/>
             </w:rPr>
           </w:pPr>
-          <w:hyperlink w:anchor="_Toc243907524" w:history="1">
+          <w:hyperlink w:anchor="_Toc243949489" w:history="1">
             <w:r>
               <w:rPr>
                 <w:rStyle w:val="Hyperlink"/>
@@ -3355,7 +3355,7 @@
               <w:rPr>
                 <w:noProof/>
               </w:rPr>
-              <w:instrText xml:space="preserve"> PAGEREF _Toc243907524 \h </w:instrText>
+              <w:instrText xml:space="preserve"> PAGEREF _Toc243949489 \h </w:instrText>
             </w:r>
             <w:r>
               <w:rPr>
@@ -3372,7 +3372,7 @@
               <w:rPr>
                 <w:noProof/>
               </w:rPr>
-              <w:t>18</w:t>
+              <w:t>19</w:t>
             </w:r>
             <w:r>
               <w:rPr>
@@ -3395,7 +3395,7 @@
               <w14:ligatures w14:val="standardContextual"/>
             </w:rPr>
           </w:pPr>
-          <w:hyperlink w:anchor="_Toc243907525" w:history="1">
+          <w:hyperlink w:anchor="_Toc243949490" w:history="1">
             <w:r>
               <w:rPr>
                 <w:rStyle w:val="Hyperlink"/>
@@ -3419,7 +3419,7 @@
               <w:rPr>
                 <w:noProof/>
               </w:rPr>
-              <w:instrText xml:space="preserve"> PAGEREF _Toc243907525 \h </w:instrText>
+              <w:instrText xml:space="preserve"> PAGEREF _Toc243949490 \h </w:instrText>
             </w:r>
             <w:r>
               <w:rPr>
@@ -3436,7 +3436,7 @@
               <w:rPr>
                 <w:noProof/>
               </w:rPr>
-              <w:t>19</w:t>
+              <w:t>20</w:t>
             </w:r>
             <w:r>
               <w:rPr>
@@ -3459,7 +3459,7 @@
               <w14:ligatures w14:val="standardContextual"/>
             </w:rPr>
           </w:pPr>
-          <w:hyperlink w:anchor="_Toc243907526" w:history="1">
+          <w:hyperlink w:anchor="_Toc243949491" w:history="1">
             <w:r>
               <w:rPr>
                 <w:rStyle w:val="Hyperlink"/>
@@ -3483,7 +3483,7 @@
               <w:rPr>
                 <w:noProof/>
               </w:rPr>
-              <w:instrText xml:space="preserve"> PAGEREF _Toc243907526 \h </w:instrText>
+              <w:instrText xml:space="preserve"> PAGEREF _Toc243949491 \h </w:instrText>
             </w:r>
             <w:r>
               <w:rPr>
@@ -3500,7 +3500,7 @@
               <w:rPr>
                 <w:noProof/>
               </w:rPr>
-              <w:t>20</w:t>
+              <w:t>21</w:t>
             </w:r>
             <w:r>
               <w:rPr>
@@ -3523,7 +3523,7 @@
               <w14:ligatures w14:val="standardContextual"/>
             </w:rPr>
           </w:pPr>
-          <w:hyperlink w:anchor="_Toc243907527" w:history="1">
+          <w:hyperlink w:anchor="_Toc243949492" w:history="1">
             <w:r>
               <w:rPr>
                 <w:rStyle w:val="Hyperlink"/>
@@ -3547,7 +3547,7 @@
               <w:rPr>
                 <w:noProof/>
               </w:rPr>
-              <w:instrText xml:space="preserve"> PAGEREF _Toc243907527 \h </w:instrText>
+              <w:instrText xml:space="preserve"> PAGEREF _Toc243949492 \h </w:instrText>
             </w:r>
             <w:r>
               <w:rPr>
@@ -3564,7 +3564,7 @@
               <w:rPr>
                 <w:noProof/>
               </w:rPr>
-              <w:t>22</w:t>
+              <w:t>23</w:t>
             </w:r>
             <w:r>
               <w:rPr>
@@ -3587,7 +3587,7 @@
               <w14:ligatures w14:val="standardContextual"/>
             </w:rPr>
           </w:pPr>
-          <w:hyperlink w:anchor="_Toc243907528" w:history="1">
+          <w:hyperlink w:anchor="_Toc243949493" w:history="1">
             <w:r>
               <w:rPr>
                 <w:rStyle w:val="Hyperlink"/>
@@ -3611,7 +3611,7 @@
               <w:rPr>
                 <w:noProof/>
               </w:rPr>
-              <w:instrText xml:space="preserve"> PAGEREF _Toc243907528 \h </w:instrText>
+              <w:instrText xml:space="preserve"> PAGEREF _Toc243949493 \h </w:instrText>
             </w:r>
             <w:r>
               <w:rPr>
@@ -3628,7 +3628,7 @@
               <w:rPr>
                 <w:noProof/>
               </w:rPr>
-              <w:t>22</w:t>
+              <w:t>23</w:t>
             </w:r>
             <w:r>
               <w:rPr>
@@ -3651,7 +3651,7 @@
               <w14:ligatures w14:val="standardContextual"/>
             </w:rPr>
           </w:pPr>
-          <w:hyperlink w:anchor="_Toc243907529" w:history="1">
+          <w:hyperlink w:anchor="_Toc243949494" w:history="1">
             <w:r>
               <w:rPr>
                 <w:rStyle w:val="Hyperlink"/>
@@ -3675,7 +3675,7 @@
               <w:rPr>
                 <w:noProof/>
               </w:rPr>
-              <w:instrText xml:space="preserve"> PAGEREF _Toc243907529 \h </w:instrText>
+              <w:instrText xml:space="preserve"> PAGEREF _Toc243949494 \h </w:instrText>
             </w:r>
             <w:r>
               <w:rPr>
@@ -3692,7 +3692,7 @@
               <w:rPr>
                 <w:noProof/>
               </w:rPr>
-              <w:t>22</w:t>
+              <w:t>23</w:t>
             </w:r>
             <w:r>
               <w:rPr>
@@ -3715,7 +3715,7 @@
               <w14:ligatures w14:val="standardContextual"/>
             </w:rPr>
           </w:pPr>
-          <w:hyperlink w:anchor="_Toc243907530" w:history="1">
+          <w:hyperlink w:anchor="_Toc243949495" w:history="1">
             <w:r>
               <w:rPr>
                 <w:rStyle w:val="Hyperlink"/>
@@ -3739,7 +3739,7 @@
               <w:rPr>
                 <w:noProof/>
               </w:rPr>
-              <w:instrText xml:space="preserve"> PAGEREF _Toc243907530 \h </w:instrText>
+              <w:instrText xml:space="preserve"> PAGEREF _Toc243949495 \h </w:instrText>
             </w:r>
             <w:r>
               <w:rPr>
@@ -3756,7 +3756,7 @@
               <w:rPr>
                 <w:noProof/>
               </w:rPr>
-              <w:t>23</w:t>
+              <w:t>24</w:t>
             </w:r>
             <w:r>
               <w:rPr>
@@ -3779,7 +3779,7 @@
               <w14:ligatures w14:val="standardContextual"/>
             </w:rPr>
           </w:pPr>
-          <w:hyperlink w:anchor="_Toc243907531" w:history="1">
+          <w:hyperlink w:anchor="_Toc243949496" w:history="1">
             <w:r>
               <w:rPr>
                 <w:rStyle w:val="Hyperlink"/>
@@ -3803,7 +3803,7 @@
               <w:rPr>
                 <w:noProof/>
               </w:rPr>
-              <w:instrText xml:space="preserve"> PAGEREF _Toc243907531 \h </w:instrText>
+              <w:instrText xml:space="preserve"> PAGEREF _Toc243949496 \h </w:instrText>
             </w:r>
             <w:r>
               <w:rPr>
@@ -3820,7 +3820,7 @@
               <w:rPr>
                 <w:noProof/>
               </w:rPr>
-              <w:t>24</w:t>
+              <w:t>25</w:t>
             </w:r>
             <w:r>
               <w:rPr>
@@ -3843,7 +3843,7 @@
               <w14:ligatures w14:val="standardContextual"/>
             </w:rPr>
           </w:pPr>
-          <w:hyperlink w:anchor="_Toc243907532" w:history="1">
+          <w:hyperlink w:anchor="_Toc243949497" w:history="1">
             <w:r>
               <w:rPr>
                 <w:rStyle w:val="Hyperlink"/>
@@ -3867,7 +3867,7 @@
               <w:rPr>
                 <w:noProof/>
               </w:rPr>
-              <w:instrText xml:space="preserve"> PAGEREF _Toc243907532 \h </w:instrText>
+              <w:instrText xml:space="preserve"> PAGEREF _Toc243949497 \h </w:instrText>
             </w:r>
             <w:r>
               <w:rPr>
@@ -3884,7 +3884,7 @@
               <w:rPr>
                 <w:noProof/>
               </w:rPr>
-              <w:t>24</w:t>
+              <w:t>25</w:t>
             </w:r>
             <w:r>
               <w:rPr>
@@ -3907,7 +3907,7 @@
               <w14:ligatures w14:val="standardContextual"/>
             </w:rPr>
           </w:pPr>
-          <w:hyperlink w:anchor="_Toc243907533" w:history="1">
+          <w:hyperlink w:anchor="_Toc243949498" w:history="1">
             <w:r>
               <w:rPr>
                 <w:rStyle w:val="Hyperlink"/>
@@ -3931,7 +3931,7 @@
               <w:rPr>
                 <w:noProof/>
               </w:rPr>
-              <w:instrText xml:space="preserve"> PAGEREF _Toc243907533 \h </w:instrText>
+              <w:instrText xml:space="preserve"> PAGEREF _Toc243949498 \h </w:instrText>
             </w:r>
             <w:r>
               <w:rPr>
@@ -3948,7 +3948,71 @@
               <w:rPr>
                 <w:noProof/>
               </w:rPr>
-              <w:t>27</w:t>
+              <w:t>28</w:t>
+            </w:r>
+            <w:r>
+              <w:rPr>
+                <w:noProof/>
+              </w:rPr>
+              <w:fldChar w:fldCharType="end"/>
+            </w:r>
+          </w:hyperlink>
+        </w:p>
+        <w:p>
+          <w:pPr>
+            <w:pStyle w:val="TOC2"/>
+            <w:tabs>
+              <w:tab w:val="right" w:leader="dot" w:pos="9016"/>
+            </w:tabs>
+            <w:rPr>
+              <w:rFonts w:asciiTheme="minorHAnsi" w:eastAsiaTheme="minorEastAsia" w:hAnsiTheme="minorHAnsi" w:cstheme="minorBidi"/>
+              <w:noProof/>
+              <w:kern w:val="2"/>
+              <w14:ligatures w14:val="standardContextual"/>
+            </w:rPr>
+          </w:pPr>
+          <w:hyperlink w:anchor="_Toc243949499" w:history="1">
+            <w:r>
+              <w:rPr>
+                <w:rStyle w:val="Hyperlink"/>
+                <w:noProof/>
+              </w:rPr>
+              <w:t>6.3 Live Deployment</w:t>
+            </w:r>
+            <w:r>
+              <w:rPr>
+                <w:noProof/>
+              </w:rPr>
+              <w:tab/>
+            </w:r>
+            <w:r>
+              <w:rPr>
+                <w:noProof/>
+              </w:rPr>
+              <w:fldChar w:fldCharType="begin"/>
+            </w:r>
+            <w:r>
+              <w:rPr>
+                <w:noProof/>
+              </w:rPr>
+              <w:instrText xml:space="preserve"> PAGEREF _Toc243949499 \h </w:instrText>
+            </w:r>
+            <w:r>
+              <w:rPr>
+                <w:noProof/>
+              </w:rPr>
+            </w:r>
+            <w:r>
+              <w:rPr>
+                <w:noProof/>
+              </w:rPr>
+              <w:fldChar w:fldCharType="separate"/>
+            </w:r>
+            <w:r>
+              <w:rPr>
+                <w:noProof/>
+              </w:rPr>
+              <w:t>30</w:t>
             </w:r>
             <w:r>
               <w:rPr>
@@ -3971,7 +4035,7 @@
               <w14:ligatures w14:val="standardContextual"/>
             </w:rPr>
           </w:pPr>
-          <w:hyperlink w:anchor="_Toc243907534" w:history="1">
+          <w:hyperlink w:anchor="_Toc243949500" w:history="1">
             <w:r>
               <w:rPr>
                 <w:rStyle w:val="Hyperlink"/>
@@ -3995,7 +4059,7 @@
               <w:rPr>
                 <w:noProof/>
               </w:rPr>
-              <w:instrText xml:space="preserve"> PAGEREF _Toc243907534 \h </w:instrText>
+              <w:instrText xml:space="preserve"> PAGEREF _Toc243949500 \h </w:instrText>
             </w:r>
             <w:r>
               <w:rPr>
@@ -4012,7 +4076,7 @@
               <w:rPr>
                 <w:noProof/>
               </w:rPr>
-              <w:t>29</w:t>
+              <w:t>31</w:t>
             </w:r>
             <w:r>
               <w:rPr>
@@ -4035,7 +4099,7 @@
               <w14:ligatures w14:val="standardContextual"/>
             </w:rPr>
           </w:pPr>
-          <w:hyperlink w:anchor="_Toc243907535" w:history="1">
+          <w:hyperlink w:anchor="_Toc243949501" w:history="1">
             <w:r>
               <w:rPr>
                 <w:rStyle w:val="Hyperlink"/>
@@ -4059,7 +4123,7 @@
               <w:rPr>
                 <w:noProof/>
               </w:rPr>
-              <w:instrText xml:space="preserve"> PAGEREF _Toc243907535 \h </w:instrText>
+              <w:instrText xml:space="preserve"> PAGEREF _Toc243949501 \h </w:instrText>
             </w:r>
             <w:r>
               <w:rPr>
@@ -4076,7 +4140,7 @@
               <w:rPr>
                 <w:noProof/>
               </w:rPr>
-              <w:t>29</w:t>
+              <w:t>31</w:t>
             </w:r>
             <w:r>
               <w:rPr>
@@ -4099,7 +4163,7 @@
               <w14:ligatures w14:val="standardContextual"/>
             </w:rPr>
           </w:pPr>
-          <w:hyperlink w:anchor="_Toc243907536" w:history="1">
+          <w:hyperlink w:anchor="_Toc243949502" w:history="1">
             <w:r>
               <w:rPr>
                 <w:rStyle w:val="Hyperlink"/>
@@ -4123,7 +4187,7 @@
               <w:rPr>
                 <w:noProof/>
               </w:rPr>
-              <w:instrText xml:space="preserve"> PAGEREF _Toc243907536 \h </w:instrText>
+              <w:instrText xml:space="preserve"> PAGEREF _Toc243949502 \h </w:instrText>
             </w:r>
             <w:r>
               <w:rPr>
@@ -4140,7 +4204,7 @@
               <w:rPr>
                 <w:noProof/>
               </w:rPr>
-              <w:t>29</w:t>
+              <w:t>31</w:t>
             </w:r>
             <w:r>
               <w:rPr>
@@ -4163,7 +4227,7 @@
               <w14:ligatures w14:val="standardContextual"/>
             </w:rPr>
           </w:pPr>
-          <w:hyperlink w:anchor="_Toc243907537" w:history="1">
+          <w:hyperlink w:anchor="_Toc243949503" w:history="1">
             <w:r>
               <w:rPr>
                 <w:rStyle w:val="Hyperlink"/>
@@ -4187,7 +4251,7 @@
               <w:rPr>
                 <w:noProof/>
               </w:rPr>
-              <w:instrText xml:space="preserve"> PAGEREF _Toc243907537 \h </w:instrText>
+              <w:instrText xml:space="preserve"> PAGEREF _Toc243949503 \h </w:instrText>
             </w:r>
             <w:r>
               <w:rPr>
@@ -4204,7 +4268,7 @@
               <w:rPr>
                 <w:noProof/>
               </w:rPr>
-              <w:t>30</w:t>
+              <w:t>32</w:t>
             </w:r>
             <w:r>
               <w:rPr>
@@ -4227,7 +4291,7 @@
               <w14:ligatures w14:val="standardContextual"/>
             </w:rPr>
           </w:pPr>
-          <w:hyperlink w:anchor="_Toc243907538" w:history="1">
+          <w:hyperlink w:anchor="_Toc243949504" w:history="1">
             <w:r>
               <w:rPr>
                 <w:rStyle w:val="Hyperlink"/>
@@ -4251,7 +4315,7 @@
               <w:rPr>
                 <w:noProof/>
               </w:rPr>
-              <w:instrText xml:space="preserve"> PAGEREF _Toc243907538 \h </w:instrText>
+              <w:instrText xml:space="preserve"> PAGEREF _Toc243949504 \h </w:instrText>
             </w:r>
             <w:r>
               <w:rPr>
@@ -4268,7 +4332,7 @@
               <w:rPr>
                 <w:noProof/>
               </w:rPr>
-              <w:t>31</w:t>
+              <w:t>33</w:t>
             </w:r>
             <w:r>
               <w:rPr>
@@ -4291,7 +4355,7 @@
               <w14:ligatures w14:val="standardContextual"/>
             </w:rPr>
           </w:pPr>
-          <w:hyperlink w:anchor="_Toc243907539" w:history="1">
+          <w:hyperlink w:anchor="_Toc243949505" w:history="1">
             <w:r>
               <w:rPr>
                 <w:rStyle w:val="Hyperlink"/>
@@ -4315,7 +4379,7 @@
               <w:rPr>
                 <w:noProof/>
               </w:rPr>
-              <w:instrText xml:space="preserve"> PAGEREF _Toc243907539 \h </w:instrText>
+              <w:instrText xml:space="preserve"> PAGEREF _Toc243949505 \h </w:instrText>
             </w:r>
             <w:r>
               <w:rPr>
@@ -4332,7 +4396,7 @@
               <w:rPr>
                 <w:noProof/>
               </w:rPr>
-              <w:t>31</w:t>
+              <w:t>33</w:t>
             </w:r>
             <w:r>
               <w:rPr>
@@ -4355,7 +4419,7 @@
               <w14:ligatures w14:val="standardContextual"/>
             </w:rPr>
           </w:pPr>
-          <w:hyperlink w:anchor="_Toc243907540" w:history="1">
+          <w:hyperlink w:anchor="_Toc243949506" w:history="1">
             <w:r>
               <w:rPr>
                 <w:rStyle w:val="Hyperlink"/>
@@ -4379,7 +4443,7 @@
               <w:rPr>
                 <w:noProof/>
               </w:rPr>
-              <w:instrText xml:space="preserve"> PAGEREF _Toc243907540 \h </w:instrText>
+              <w:instrText xml:space="preserve"> PAGEREF _Toc243949506 \h </w:instrText>
             </w:r>
             <w:r>
               <w:rPr>
@@ -4396,7 +4460,7 @@
               <w:rPr>
                 <w:noProof/>
               </w:rPr>
-              <w:t>31</w:t>
+              <w:t>33</w:t>
             </w:r>
             <w:r>
               <w:rPr>
@@ -4419,7 +4483,7 @@
               <w14:ligatures w14:val="standardContextual"/>
             </w:rPr>
           </w:pPr>
-          <w:hyperlink w:anchor="_Toc243907541" w:history="1">
+          <w:hyperlink w:anchor="_Toc243949507" w:history="1">
             <w:r>
               <w:rPr>
                 <w:rStyle w:val="Hyperlink"/>
@@ -4443,7 +4507,7 @@
               <w:rPr>
                 <w:noProof/>
               </w:rPr>
-              <w:instrText xml:space="preserve"> PAGEREF _Toc243907541 \h </w:instrText>
+              <w:instrText xml:space="preserve"> PAGEREF _Toc243949507 \h </w:instrText>
             </w:r>
             <w:r>
               <w:rPr>
@@ -4460,7 +4524,7 @@
               <w:rPr>
                 <w:noProof/>
               </w:rPr>
-              <w:t>31</w:t>
+              <w:t>33</w:t>
             </w:r>
             <w:r>
               <w:rPr>
@@ -4482,7 +4546,7 @@
         <w:pStyle w:val="Heading1"/>
         <w:pageBreakBefore/>
       </w:pPr>
-      <w:bookmarkStart w:id="9" w:name="_Toc243907502"/>
+      <w:bookmarkStart w:id="9" w:name="_Toc243949467"/>
       <w:r>
         <w:t>1. Features Implemented</w:t>
       </w:r>
@@ -4494,7 +4558,7 @@
         <w:jc w:val="both"/>
       </w:pPr>
       <w:r>
-        <w:t>All features listed below were implemented in the repository and exercised on the Android emulator against the Firebase Emulator Suite. Figures referenced in this chapter appear in Chapter 6.</w:t>
+        <w:t>All features listed below were implemented in the repository and exercised on the Android emulator against the Firebase Emulator Suite, and then on the live Firebase project with a physical phone. Figures referenced in this chapter appear in Chapter 6.</w:t>
       </w:r>
     </w:p>
     <w:p>
@@ -4503,7 +4567,7 @@
         <w:keepNext/>
         <w:spacing w:before="200"/>
       </w:pPr>
-      <w:bookmarkStart w:id="10" w:name="_Toc243907503"/>
+      <w:bookmarkStart w:id="10" w:name="_Toc243949468"/>
       <w:r>
         <w:t>1.1 Student Portal</w:t>
       </w:r>
@@ -4526,7 +4590,7 @@
         <w:t>Onboarding and authentication:</w:t>
       </w:r>
       <w:r>
-        <w:t xml:space="preserve"> three-slide onboarding, sign-in, student registration, password reset and logout. Registration always creates the STUDENT role.</w:t>
+        <w:t xml:space="preserve"> three-slide onboarding, sign-in, registration with a Student / Placement officer choice, password reset and logout. Skills typed as a comma-separated list are split into separate skills.</w:t>
       </w:r>
     </w:p>
     <w:p>
@@ -4675,7 +4739,7 @@
         <w:keepNext/>
         <w:spacing w:before="200"/>
       </w:pPr>
-      <w:bookmarkStart w:id="11" w:name="_Toc243907504"/>
+      <w:bookmarkStart w:id="11" w:name="_Toc243949469"/>
       <w:r>
         <w:t>1.2 Placement Officer Portal</w:t>
       </w:r>
@@ -4778,7 +4842,7 @@
         <w:t>Announcements and analytics:</w:t>
       </w:r>
       <w:r>
-        <w:t xml:space="preserve"> announcement composer; applications per drive, recruitment funnel, branch-wise selections, readiness of applicants versus selected students and preparation insights.</w:t>
+        <w:t xml:space="preserve"> announcement composer; publishing or reopening a drive automatically notifies every student; applications per drive, recruitment funnel, branch-wise selections, readiness of applicants versus selected students and preparation insights.</w:t>
       </w:r>
     </w:p>
     <w:p>
@@ -4787,7 +4851,7 @@
         <w:keepNext/>
         <w:spacing w:before="200"/>
       </w:pPr>
-      <w:bookmarkStart w:id="12" w:name="_Toc243907505"/>
+      <w:bookmarkStart w:id="12" w:name="_Toc243949470"/>
       <w:r>
         <w:t>1.3 Explainable Eligibility Engine</w:t>
       </w:r>
@@ -4811,7 +4875,7 @@
         <w:keepNext/>
         <w:spacing w:before="200"/>
       </w:pPr>
-      <w:bookmarkStart w:id="13" w:name="_Toc243907506"/>
+      <w:bookmarkStart w:id="13" w:name="_Toc243949471"/>
       <w:r>
         <w:t>1.4 Explainable Match Score</w:t>
       </w:r>
@@ -4835,7 +4899,7 @@
         <w:keepNext/>
         <w:spacing w:before="200"/>
       </w:pPr>
-      <w:bookmarkStart w:id="14" w:name="_Toc243907507"/>
+      <w:bookmarkStart w:id="14" w:name="_Toc243949472"/>
       <w:r>
         <w:t>1.5 Placement Readiness Dashboard</w:t>
       </w:r>
@@ -4859,7 +4923,7 @@
         <w:keepNext/>
         <w:spacing w:before="200"/>
       </w:pPr>
-      <w:bookmarkStart w:id="15" w:name="_Toc243907508"/>
+      <w:bookmarkStart w:id="15" w:name="_Toc243949473"/>
       <w:r>
         <w:t>1.6 Career Action Engine</w:t>
       </w:r>
@@ -5904,7 +5968,7 @@
         <w:keepNext/>
         <w:spacing w:before="200"/>
       </w:pPr>
-      <w:bookmarkStart w:id="16" w:name="_Toc243907509"/>
+      <w:bookmarkStart w:id="16" w:name="_Toc243949474"/>
       <w:r>
         <w:t>1.7 Application Workflow</w:t>
       </w:r>
@@ -5928,7 +5992,7 @@
         <w:keepNext/>
         <w:spacing w:before="200"/>
       </w:pPr>
-      <w:bookmarkStart w:id="17" w:name="_Toc243907510"/>
+      <w:bookmarkStart w:id="17" w:name="_Toc243949475"/>
       <w:r>
         <w:t>1.8 Offline Behaviour</w:t>
       </w:r>
@@ -5949,7 +6013,7 @@
         <w:keepNext/>
         <w:spacing w:before="200"/>
       </w:pPr>
-      <w:bookmarkStart w:id="18" w:name="_Toc243907511"/>
+      <w:bookmarkStart w:id="18" w:name="_Toc243949476"/>
       <w:r>
         <w:t>1.9 Announcements, Notifications and Analytics</w:t>
       </w:r>
@@ -5961,10 +6025,10 @@
         <w:jc w:val="both"/>
       </w:pPr>
       <w:r>
-        <w:t>Officers publish announcements to all students; officer decisions create targeted notifications. While the app is open, a Firestore listener posts local notifications; in the background, SyncWorker checks every 15 minutes whenever a network connection is available. The officer analytics screen shows applications per drive, a per-drive recruitment funnel, branch-wise selections, readiness of applicants versus selected students, and preparation insights: average readiness per component and the most common mis</w:t>
-      </w:r>
-      <w:r>
-        <w:t>sing skills among verified students eligible for open drives. Insights are aggregate counts only and are withheld when fewer than three students are covered.</w:t>
+        <w:t>Officers publish announcements to all students, and publishing or reopening a drive automatically sends a "New drive" announcement linked to that drive; officer decisions create targeted notifications. While the app is open, a Firestore listener posts local notifications; in the background, SyncWorker checks every 15 minutes whenever a network connection is available. The officer analytics screen shows applications per drive, a per-drive recruitment funnel, branch-wise selections, readiness of applicants ve</w:t>
+      </w:r>
+      <w:r>
+        <w:t>rsus selected students, and preparation insights: average readiness per component and the most common missing skills among verified students eligible for open drives. Insights are aggregate counts only and are withheld when fewer than three students are covered.</w:t>
       </w:r>
     </w:p>
     <w:p>
@@ -5972,7 +6036,7 @@
         <w:pStyle w:val="Heading1"/>
         <w:pageBreakBefore/>
       </w:pPr>
-      <w:bookmarkStart w:id="19" w:name="_Toc243907512"/>
+      <w:bookmarkStart w:id="19" w:name="_Toc243949477"/>
       <w:r>
         <w:t>2. Application Screens</w:t>
       </w:r>
@@ -6347,7 +6411,7 @@
                 <w:sz w:val="20"/>
                 <w:szCs w:val="20"/>
               </w:rPr>
-              <w:t>Authentication, student registration, password reset</w:t>
+              <w:t>Authentication, registration as student or officer, password reset</w:t>
             </w:r>
           </w:p>
         </w:tc>
@@ -8224,7 +8288,7 @@
       <w:pPr>
         <w:pStyle w:val="Heading1"/>
       </w:pPr>
-      <w:bookmarkStart w:id="20" w:name="_Toc243907513"/>
+      <w:bookmarkStart w:id="20" w:name="_Toc243949478"/>
       <w:r>
         <w:t>3. System Design and Blueprints</w:t>
       </w:r>
@@ -8245,7 +8309,7 @@
         <w:keepNext/>
         <w:spacing w:before="200"/>
       </w:pPr>
-      <w:bookmarkStart w:id="21" w:name="_Toc243907514"/>
+      <w:bookmarkStart w:id="21" w:name="_Toc243949479"/>
       <w:r>
         <w:t>3.1 System Architecture</w:t>
       </w:r>
@@ -8262,7 +8326,7 @@
           <w:noProof/>
         </w:rPr>
         <w:drawing>
-          <wp:inline distT="0" distB="0" distL="0" distR="0" wp14:anchorId="5724BE10" wp14:editId="379C5C35">
+          <wp:inline distT="0" distB="0" distL="0" distR="0" wp14:anchorId="05DFE28E" wp14:editId="790325B1">
             <wp:extent cx="7410450" cy="4572000"/>
             <wp:effectExtent l="0" t="0" r="0" b="0"/>
             <wp:docPr id="2" name="jpg/d1_architecture.png" descr="NEXORA system architecture (MVVM + Repository)" title="NEXORA system architecture (MVVM + Repository)"/>
@@ -8332,7 +8396,7 @@
         <w:pageBreakBefore/>
         <w:spacing w:after="100"/>
       </w:pPr>
-      <w:bookmarkStart w:id="22" w:name="_Toc243907515"/>
+      <w:bookmarkStart w:id="22" w:name="_Toc243949480"/>
       <w:r>
         <w:t>3.2 Module Structure</w:t>
       </w:r>
@@ -8358,7 +8422,7 @@
           <w:noProof/>
         </w:rPr>
         <w:drawing>
-          <wp:inline distT="0" distB="0" distL="0" distR="0" wp14:anchorId="048A226B" wp14:editId="42570916">
+          <wp:inline distT="0" distB="0" distL="0" distR="0" wp14:anchorId="08C9FBC7" wp14:editId="47CCBA2A">
             <wp:extent cx="8505825" cy="2762250"/>
             <wp:effectExtent l="0" t="0" r="0" b="0"/>
             <wp:docPr id="3" name="jpg/d2_modules.png" descr="Package and class structure" title="Package and class structure"/>
@@ -8428,7 +8492,7 @@
         <w:pageBreakBefore/>
         <w:spacing w:after="100"/>
       </w:pPr>
-      <w:bookmarkStart w:id="23" w:name="_Toc243907516"/>
+      <w:bookmarkStart w:id="23" w:name="_Toc243949481"/>
       <w:r>
         <w:t>3.3 Use Cases</w:t>
       </w:r>
@@ -8445,7 +8509,7 @@
           <w:noProof/>
         </w:rPr>
         <w:drawing>
-          <wp:inline distT="0" distB="0" distL="0" distR="0" wp14:anchorId="20045CE6" wp14:editId="626C971B">
+          <wp:inline distT="0" distB="0" distL="0" distR="0" wp14:anchorId="140EB1EE" wp14:editId="12CCB4AE">
             <wp:extent cx="7515225" cy="4848225"/>
             <wp:effectExtent l="0" t="0" r="0" b="0"/>
             <wp:docPr id="4" name="jpg/d3_use_cases.png" descr="Use-case diagram for students and placement officers" title="Use-case diagram for students and placement officers"/>
@@ -8515,7 +8579,7 @@
         <w:pageBreakBefore/>
         <w:spacing w:after="100"/>
       </w:pPr>
-      <w:bookmarkStart w:id="24" w:name="_Toc243907517"/>
+      <w:bookmarkStart w:id="24" w:name="_Toc243949482"/>
       <w:r>
         <w:t>3.4 Integrated Workflow</w:t>
       </w:r>
@@ -8541,7 +8605,7 @@
           <w:noProof/>
         </w:rPr>
         <w:drawing>
-          <wp:inline distT="0" distB="0" distL="0" distR="0" wp14:anchorId="7AEDBF72" wp14:editId="0DD6740D">
+          <wp:inline distT="0" distB="0" distL="0" distR="0" wp14:anchorId="523C3A0C" wp14:editId="6B8BB918">
             <wp:extent cx="8505825" cy="2876550"/>
             <wp:effectExtent l="0" t="0" r="0" b="0"/>
             <wp:docPr id="5" name="jpg/d4_workflow.png" descr="Integrated placement-intelligence workflow" title="Integrated placement-intelligence workflow"/>
@@ -8611,7 +8675,7 @@
         <w:pageBreakBefore/>
         <w:spacing w:after="100"/>
       </w:pPr>
-      <w:bookmarkStart w:id="25" w:name="_Toc243907518"/>
+      <w:bookmarkStart w:id="25" w:name="_Toc243949483"/>
       <w:r>
         <w:t>3.5 Screen Navigation</w:t>
       </w:r>
@@ -8628,7 +8692,7 @@
           <w:noProof/>
         </w:rPr>
         <w:drawing>
-          <wp:inline distT="0" distB="0" distL="0" distR="0" wp14:anchorId="772EBF1B" wp14:editId="57666B57">
+          <wp:inline distT="0" distB="0" distL="0" distR="0" wp14:anchorId="6A48CCA5" wp14:editId="05DFCAC2">
             <wp:extent cx="8039100" cy="4848225"/>
             <wp:effectExtent l="0" t="0" r="0" b="0"/>
             <wp:docPr id="6" name="jpg/d5_navigation.png" descr="Screen navigation for both roles and Career Action Plan targets" title="Screen navigation for both roles and Career Action Plan targets"/>
@@ -8698,7 +8762,7 @@
         <w:pageBreakBefore/>
         <w:spacing w:after="100"/>
       </w:pPr>
-      <w:bookmarkStart w:id="26" w:name="_Toc243907519"/>
+      <w:bookmarkStart w:id="26" w:name="_Toc243949484"/>
       <w:r>
         <w:t>3.6 Application Lifecycle</w:t>
       </w:r>
@@ -8715,7 +8779,7 @@
           <w:noProof/>
         </w:rPr>
         <w:drawing>
-          <wp:inline distT="0" distB="0" distL="0" distR="0" wp14:anchorId="0F30BE40" wp14:editId="5BFF6854">
+          <wp:inline distT="0" distB="0" distL="0" distR="0" wp14:anchorId="75722EC5" wp14:editId="3879218B">
             <wp:extent cx="8505825" cy="3095625"/>
             <wp:effectExtent l="0" t="0" r="0" b="0"/>
             <wp:docPr id="7" name="jpg/d7_status.png" descr="Application status transitions" title="Application status transitions"/>
@@ -8785,7 +8849,7 @@
         <w:pageBreakBefore/>
         <w:spacing w:after="100"/>
       </w:pPr>
-      <w:bookmarkStart w:id="27" w:name="_Toc243907520"/>
+      <w:bookmarkStart w:id="27" w:name="_Toc243949485"/>
       <w:r>
         <w:t>3.7 Data Model and Security</w:t>
       </w:r>
@@ -8811,7 +8875,7 @@
           <w:noProof/>
         </w:rPr>
         <w:drawing>
-          <wp:inline distT="0" distB="0" distL="0" distR="0" wp14:anchorId="70523880" wp14:editId="1D4E8C79">
+          <wp:inline distT="0" distB="0" distL="0" distR="0" wp14:anchorId="1A08B394" wp14:editId="5ADE05B0">
             <wp:extent cx="6657975" cy="4391025"/>
             <wp:effectExtent l="0" t="0" r="0" b="0"/>
             <wp:docPr id="8" name="jpg/d6_data_security.png" descr="Data model and Firestore Security Rules" title="Data model and Firestore Security Rules"/>
@@ -8885,7 +8949,7 @@
       <w:pPr>
         <w:pStyle w:val="Heading1"/>
       </w:pPr>
-      <w:bookmarkStart w:id="28" w:name="_Toc243907521"/>
+      <w:bookmarkStart w:id="28" w:name="_Toc243949486"/>
       <w:r>
         <w:t>4. Implementation and Code</w:t>
       </w:r>
@@ -8897,7 +8961,7 @@
         <w:keepNext/>
         <w:spacing w:before="200"/>
       </w:pPr>
-      <w:bookmarkStart w:id="29" w:name="_Toc243907522"/>
+      <w:bookmarkStart w:id="29" w:name="_Toc243949487"/>
       <w:r>
         <w:t>4.1 Key Java Classes</w:t>
       </w:r>
@@ -9641,7 +9705,7 @@
         <w:keepNext/>
         <w:spacing w:before="200"/>
       </w:pPr>
-      <w:bookmarkStart w:id="30" w:name="_Toc243907523"/>
+      <w:bookmarkStart w:id="30" w:name="_Toc243949488"/>
       <w:r>
         <w:t>4.2 XML Layouts and Resources</w:t>
       </w:r>
@@ -9665,7 +9729,7 @@
         <w:keepNext/>
         <w:spacing w:before="200"/>
       </w:pPr>
-      <w:bookmarkStart w:id="31" w:name="_Toc243907524"/>
+      <w:bookmarkStart w:id="31" w:name="_Toc243949489"/>
       <w:r>
         <w:t>4.3 Firebase Integration</w:t>
       </w:r>
@@ -9677,7 +9741,10 @@
         <w:jc w:val="both"/>
       </w:pPr>
       <w:r>
-        <w:t>NexoraApp initialises Firebase from the options in app/google-services.json when present; without it, debug builds connect to the local Firebase Emulator Suite under the offline demo-nexora project, so no credentials are stored in the repository. Repositories expose Firestore queries through a LiveData subclass that attaches the snapshot listener in onActive() and removes it in onInactive(), preventing listener leaks. Officer accounts are created only with the Firebase Admin SDK seed script.</w:t>
+        <w:t>NexoraApp initialises Firebase from the options in app/google-services.json when present; the build then targets the live project (nexora-a014b). Without the file, debug builds connect to the local Firebase Emulator Suite under the offline demo-nexora project. The file is excluded from version control, so no credentials are stored in the repository. Repositories expose Firestore queries through a LiveData subclass that attaches the snapshot listener in onActive() and removes it in onInactive(), preventing l</w:t>
+      </w:r>
+      <w:r>
+        <w:t>istener leaks. The rules and composite indexes were deployed to the live project with the Firebase CLI.</w:t>
       </w:r>
     </w:p>
     <w:p>
@@ -9686,7 +9753,7 @@
         <w:keepNext/>
         <w:spacing w:before="200"/>
       </w:pPr>
-      <w:bookmarkStart w:id="32" w:name="_Toc243907525"/>
+      <w:bookmarkStart w:id="32" w:name="_Toc243949490"/>
       <w:r>
         <w:t>4.4 Code Excerpts</w:t>
       </w:r>
@@ -9960,7 +10027,7 @@
           <w:sz w:val="15"/>
           <w:szCs w:val="15"/>
         </w:rPr>
-        <w:t>res.s = (int) Math.round(s);</w:t>
+        <w:t xml:space="preserve">        }</w:t>
       </w:r>
     </w:p>
     <w:p>
@@ -9975,7 +10042,7 @@
           <w:sz w:val="15"/>
           <w:szCs w:val="15"/>
         </w:rPr>
-        <w:t>res.p = (int) Math.round(pScore);</w:t>
+        <w:t xml:space="preserve">    }</w:t>
       </w:r>
     </w:p>
     <w:p>
@@ -9990,7 +10057,7 @@
           <w:sz w:val="15"/>
           <w:szCs w:val="15"/>
         </w:rPr>
-        <w:t>res.r = (int) Math.round(r);</w:t>
+        <w:t xml:space="preserve">    r = sum / focus.size();</w:t>
       </w:r>
     </w:p>
     <w:p>
@@ -10005,7 +10072,7 @@
           <w:sz w:val="15"/>
           <w:szCs w:val="15"/>
         </w:rPr>
-        <w:t>res.score = (int) Math.round(weights.skills * s + weights.preference * pScore + weights.readiness * r);</w:t>
+        <w:t>}</w:t>
       </w:r>
     </w:p>
     <w:p>
@@ -10020,7 +10087,7 @@
           <w:sz w:val="15"/>
           <w:szCs w:val="15"/>
         </w:rPr>
-        <w:t>res.band = band(res.score);</w:t>
+        <w:t xml:space="preserve"> </w:t>
       </w:r>
     </w:p>
     <w:p>
@@ -10034,7 +10101,7 @@
           <w:sz w:val="15"/>
           <w:szCs w:val="15"/>
         </w:rPr>
-        <w:t>return res;</w:t>
+        <w:t>res.s = (int) Math.round(s);</w:t>
       </w:r>
     </w:p>
     <w:p>
@@ -11380,7 +11447,7 @@
         <w:keepNext/>
         <w:spacing w:before="200"/>
       </w:pPr>
-      <w:bookmarkStart w:id="33" w:name="_Toc243907526"/>
+      <w:bookmarkStart w:id="33" w:name="_Toc243949491"/>
       <w:r>
         <w:t>4.5 Firestore Security Rules</w:t>
       </w:r>
@@ -11392,10 +11459,10 @@
         <w:jc w:val="both"/>
       </w:pPr>
       <w:r>
-        <w:t>The rules are the authoritative gate because the client is untrusted. Registration can only create the STUDENT role; academic fields cannot change after verification; only officers can verify records (stamped with their own uid and the server time), write drives and companies, record outcomes and publish notifications; students cannot read draft drives or other students' data. Application creation re-checks eligibility, the deadline and the drive status, and requires the denormalised snapshot, names and tit</w:t>
-      </w:r>
-      <w:r>
-        <w:t>les to equal the real profile and drive.</w:t>
+        <w:t>The rules are the authoritative gate because the client is untrusted. Registration can create only the STUDENT or OFFICER role, and the role can never be changed afterwards from the client (open officer sign-up is a deliberate project decision; a production deployment would add officer approval); academic fields cannot change after verification; only officers can verify records (stamped with their own uid and the server time), write drives and companies, record outcomes and publish notifications; students c</w:t>
+      </w:r>
+      <w:r>
+        <w:t>annot read draft drives or other students' data. Application creation re-checks eligibility, the deadline and the drive status, and requires the denormalised snapshot, names and titles to equal the real profile and drive.</w:t>
       </w:r>
     </w:p>
     <w:p>
@@ -11435,7 +11502,7 @@
           <w:sz w:val="15"/>
           <w:szCs w:val="15"/>
         </w:rPr>
-        <w:t>function eligibleAndConsistent(driveId, uid) {</w:t>
+        <w:t>// plus integrity of every denormalised field against the real drive and profile.</w:t>
       </w:r>
     </w:p>
     <w:p>
@@ -11450,7 +11517,7 @@
           <w:sz w:val="15"/>
           <w:szCs w:val="15"/>
         </w:rPr>
-        <w:t xml:space="preserve">  let d = get(/databases/$(db)/documents/placementDrives/$(driveId)).data;</w:t>
+        <w:t>function eligibleAndConsistent(driveId, uid) {</w:t>
       </w:r>
     </w:p>
     <w:p>
@@ -11465,7 +11532,7 @@
           <w:sz w:val="15"/>
           <w:szCs w:val="15"/>
         </w:rPr>
-        <w:t xml:space="preserve">  let p = get(/databases/$(db)/documents/studentProfiles/$(uid)).data;</w:t>
+        <w:t xml:space="preserve">  let d = get(/databases/$(db)/documents/placementDrives/$(driveId)).data;</w:t>
       </w:r>
     </w:p>
     <w:p>
@@ -11480,7 +11547,7 @@
           <w:sz w:val="15"/>
           <w:szCs w:val="15"/>
         </w:rPr>
-        <w:t xml:space="preserve">  let a = request.resource.data;</w:t>
+        <w:t xml:space="preserve">  let p = get(/databases/$(db)/documents/studentProfiles/$(uid)).data;</w:t>
       </w:r>
     </w:p>
     <w:p>
@@ -11495,7 +11562,7 @@
           <w:sz w:val="15"/>
           <w:szCs w:val="15"/>
         </w:rPr>
-        <w:t xml:space="preserve">  return d.status == 'OPEN'</w:t>
+        <w:t xml:space="preserve">  let a = request.resource.data;</w:t>
       </w:r>
     </w:p>
     <w:p>
@@ -11510,7 +11577,7 @@
           <w:sz w:val="15"/>
           <w:szCs w:val="15"/>
         </w:rPr>
-        <w:t xml:space="preserve">    &amp;&amp; request.time &lt; d.deadline</w:t>
+        <w:t xml:space="preserve">  return d.status == 'OPEN'</w:t>
       </w:r>
     </w:p>
     <w:p>
@@ -11525,7 +11592,7 @@
           <w:sz w:val="15"/>
           <w:szCs w:val="15"/>
         </w:rPr>
-        <w:t xml:space="preserve">    &amp;&amp; p.academicVerified == true</w:t>
+        <w:t xml:space="preserve">    &amp;&amp; request.time &lt; d.deadline</w:t>
       </w:r>
     </w:p>
     <w:p>
@@ -11540,7 +11607,7 @@
           <w:sz w:val="15"/>
           <w:szCs w:val="15"/>
         </w:rPr>
-        <w:t xml:space="preserve">    &amp;&amp; p.cgpa &gt;= d.criteria.minCgpa</w:t>
+        <w:t xml:space="preserve">    &amp;&amp; p.academicVerified == true</w:t>
       </w:r>
     </w:p>
     <w:p>
@@ -11555,7 +11622,7 @@
           <w:sz w:val="15"/>
           <w:szCs w:val="15"/>
         </w:rPr>
-        <w:t xml:space="preserve">    &amp;&amp; p.branch in d.criteria.eligibleBranches</w:t>
+        <w:t xml:space="preserve">    &amp;&amp; p.cgpa &gt;= d.criteria.minCgpa</w:t>
       </w:r>
     </w:p>
     <w:p>
@@ -11570,7 +11637,7 @@
           <w:sz w:val="15"/>
           <w:szCs w:val="15"/>
         </w:rPr>
-        <w:t xml:space="preserve">    &amp;&amp; p.activeBacklogs &lt;= d.criteria.maxActiveBacklogs</w:t>
+        <w:t xml:space="preserve">    &amp;&amp; p.branch in d.criteria.eligibleBranches</w:t>
       </w:r>
     </w:p>
     <w:p>
@@ -11585,7 +11652,7 @@
           <w:sz w:val="15"/>
           <w:szCs w:val="15"/>
         </w:rPr>
-        <w:t xml:space="preserve">    &amp;&amp; p.graduationYear in d.criteria.graduationYears</w:t>
+        <w:t xml:space="preserve">    &amp;&amp; p.activeBacklogs &lt;= d.criteria.maxActiveBacklogs</w:t>
       </w:r>
     </w:p>
     <w:p>
@@ -11600,7 +11667,7 @@
           <w:sz w:val="15"/>
           <w:szCs w:val="15"/>
         </w:rPr>
-        <w:t xml:space="preserve">    &amp;&amp; a.driveTitle == d.title</w:t>
+        <w:t xml:space="preserve">    &amp;&amp; p.graduationYear in d.criteria.graduationYears</w:t>
       </w:r>
     </w:p>
     <w:p>
@@ -11615,7 +11682,7 @@
           <w:sz w:val="15"/>
           <w:szCs w:val="15"/>
         </w:rPr>
-        <w:t xml:space="preserve">    &amp;&amp; a.companyName == d.companyName</w:t>
+        <w:t xml:space="preserve">    &amp;&amp; a.driveTitle == d.title</w:t>
       </w:r>
     </w:p>
     <w:p>
@@ -11630,7 +11697,7 @@
           <w:sz w:val="15"/>
           <w:szCs w:val="15"/>
         </w:rPr>
-        <w:t xml:space="preserve">    &amp;&amp; a.studentName == p.name</w:t>
+        <w:t xml:space="preserve">    &amp;&amp; a.companyName == d.companyName</w:t>
       </w:r>
     </w:p>
     <w:p>
@@ -11645,7 +11712,7 @@
           <w:sz w:val="15"/>
           <w:szCs w:val="15"/>
         </w:rPr>
-        <w:t xml:space="preserve">    &amp;&amp; a.studentRoll == p.rollNumber</w:t>
+        <w:t xml:space="preserve">    &amp;&amp; a.studentName == p.name</w:t>
       </w:r>
     </w:p>
     <w:p>
@@ -11660,7 +11727,7 @@
           <w:sz w:val="15"/>
           <w:szCs w:val="15"/>
         </w:rPr>
-        <w:t xml:space="preserve">    &amp;&amp; a.profileSnapshot == {'cgpa': p.cgpa, 'branch': p.branch,</w:t>
+        <w:t xml:space="preserve">    &amp;&amp; a.studentRoll == p.rollNumber</w:t>
       </w:r>
     </w:p>
     <w:p>
@@ -11674,7 +11741,7 @@
           <w:sz w:val="15"/>
           <w:szCs w:val="15"/>
         </w:rPr>
-        <w:t xml:space="preserve">                             'activeBacklogs': p.activeBacklogs, 'graduationYear': p.graduationYear};</w:t>
+        <w:t xml:space="preserve">    &amp;&amp; a.profileSnapshot == {'cgpa': p.cgpa, 'branch': p.branch,</w:t>
       </w:r>
     </w:p>
     <w:p>
@@ -11687,7 +11754,7 @@
         <w:pStyle w:val="Heading1"/>
         <w:pageBreakBefore/>
       </w:pPr>
-      <w:bookmarkStart w:id="34" w:name="_Toc243907527"/>
+      <w:bookmarkStart w:id="34" w:name="_Toc243949492"/>
       <w:r>
         <w:t>5. Testing and Results</w:t>
       </w:r>
@@ -11699,7 +11766,7 @@
         <w:keepNext/>
         <w:spacing w:before="200"/>
       </w:pPr>
-      <w:bookmarkStart w:id="35" w:name="_Toc243907528"/>
+      <w:bookmarkStart w:id="35" w:name="_Toc243949493"/>
       <w:r>
         <w:t>5.1 Automated Testing</w:t>
       </w:r>
@@ -11711,7 +11778,7 @@
         <w:jc w:val="both"/>
       </w:pPr>
       <w:r>
-        <w:t>All automated suites below were executed in the project environment on 26 October 2026 and passed.</w:t>
+        <w:t>All automated suites below were executed in the project environment on 26 October 2026 and passed. The instrumented suite was last run before the final sign-up screen change; the unit and rules suites were re-run after it.</w:t>
       </w:r>
     </w:p>
     <w:tbl>
@@ -11953,7 +12020,7 @@
                 <w:sz w:val="20"/>
                 <w:szCs w:val="20"/>
               </w:rPr>
-              <w:t>64</w:t>
+              <w:t>65</w:t>
             </w:r>
           </w:p>
         </w:tc>
@@ -11982,7 +12049,7 @@
                 <w:sz w:val="20"/>
                 <w:szCs w:val="20"/>
               </w:rPr>
-              <w:t>64 passed, 0 failed</w:t>
+              <w:t>65 passed, 0 failed</w:t>
             </w:r>
           </w:p>
         </w:tc>
@@ -12103,7 +12170,7 @@
                 <w:sz w:val="20"/>
                 <w:szCs w:val="20"/>
               </w:rPr>
-              <w:t>99.2% of lines (646 of 651)</w:t>
+              <w:t>99.2% of lines (645 of 650)</w:t>
             </w:r>
           </w:p>
         </w:tc>
@@ -12316,7 +12383,7 @@
                 <w:sz w:val="20"/>
                 <w:szCs w:val="20"/>
               </w:rPr>
-              <w:t>47</w:t>
+              <w:t>48</w:t>
             </w:r>
           </w:p>
         </w:tc>
@@ -12345,7 +12412,7 @@
                 <w:sz w:val="20"/>
                 <w:szCs w:val="20"/>
               </w:rPr>
-              <w:t>47 passed, 0 failed</w:t>
+              <w:t>48 passed, 0 failed</w:t>
             </w:r>
           </w:p>
         </w:tc>
@@ -12664,7 +12731,7 @@
                 <w:sz w:val="20"/>
                 <w:szCs w:val="20"/>
               </w:rPr>
-              <w:t>24</w:t>
+              <w:t>25</w:t>
             </w:r>
           </w:p>
         </w:tc>
@@ -12693,7 +12760,7 @@
                 <w:sz w:val="20"/>
                 <w:szCs w:val="20"/>
               </w:rPr>
-              <w:t>Eligibility boundaries (7.00 vs 7.00 passes, 6.99 fails, backlog limits, missing values, unverified), match score weights, aliases, bands</w:t>
+              <w:t>Eligibility boundaries (7.00 vs 7.00 passes, 6.99 fails, backlog limits, missing values, unverified), match score weights, aliases, bands, comma-separated skill input</w:t>
             </w:r>
           </w:p>
         </w:tc>
@@ -13216,7 +13283,7 @@
                 <w:sz w:val="20"/>
                 <w:szCs w:val="20"/>
               </w:rPr>
-              <w:t>47</w:t>
+              <w:t>48</w:t>
             </w:r>
           </w:p>
         </w:tc>
@@ -13245,7 +13312,7 @@
                 <w:sz w:val="20"/>
                 <w:szCs w:val="20"/>
               </w:rPr>
-              <w:t>Role escalation, verification locking, private data, draft drives, valid and invalid applications, duplicates, deadlines, officer-only operations, notifications</w:t>
+              <w:t>Officer sign-up allowed but other roles rejected, officer cannot create a student profile, role changes blocked, verification locking, private data, draft drives, valid and invalid applications, duplicates, deadlines, officer-only operations, notifications</w:t>
             </w:r>
           </w:p>
         </w:tc>
@@ -13272,7 +13339,7 @@
         <w:keepNext/>
         <w:spacing w:before="200"/>
       </w:pPr>
-      <w:bookmarkStart w:id="36" w:name="_Toc243907529"/>
+      <w:bookmarkStart w:id="36" w:name="_Toc243949494"/>
       <w:r>
         <w:t>5.2 Manual Testing</w:t>
       </w:r>
@@ -13380,11 +13447,108 @@
     </w:p>
     <w:p>
       <w:pPr>
+        <w:pStyle w:val="Heading3"/>
+        <w:keepNext/>
+        <w:spacing w:before="140"/>
+      </w:pPr>
+      <w:r>
+        <w:t>Live deployment (real Firebase project, two devices)</w:t>
+      </w:r>
+    </w:p>
+    <w:p>
+      <w:pPr>
+        <w:spacing w:after="60" w:line="300" w:lineRule="auto"/>
+        <w:jc w:val="both"/>
+      </w:pPr>
+      <w:r>
+        <w:t>The officer portal ran on the Android emulator and the student portal on a physical Nothing phone (Android 15), both connected to the live project. All seven checks passed:</w:t>
+      </w:r>
+    </w:p>
+    <w:p>
+      <w:pPr>
+        <w:pStyle w:val="ListParagraph"/>
+        <w:numPr>
+          <w:ilvl w:val="0"/>
+          <w:numId w:val="3"/>
+        </w:numPr>
+        <w:spacing w:after="60" w:line="288" w:lineRule="auto"/>
+      </w:pPr>
+      <w:r>
+        <w:t>Officer published a drive; the phone received "New drive: Software Development Intern · TechNova Solutions" and the drive appeared in the student's plan.</w:t>
+      </w:r>
+    </w:p>
+    <w:p>
+      <w:pPr>
+        <w:pStyle w:val="ListParagraph"/>
+        <w:numPr>
+          <w:ilvl w:val="0"/>
+          <w:numId w:val="3"/>
+        </w:numPr>
+        <w:spacing w:after="60" w:line="288" w:lineRule="auto"/>
+      </w:pPr>
+      <w:r>
+        <w:t>Officer verified the student; the phone updated live to Eligible with a 65% match (0.60 × 67 + 0.25 × 100 + 0.15 × 0) and Apply enabled.</w:t>
+      </w:r>
+    </w:p>
+    <w:p>
+      <w:pPr>
+        <w:pStyle w:val="ListParagraph"/>
+        <w:numPr>
+          <w:ilvl w:val="0"/>
+          <w:numId w:val="3"/>
+        </w:numPr>
+        <w:spacing w:after="60" w:line="288" w:lineRule="auto"/>
+      </w:pPr>
+      <w:r>
+        <w:t>Student applied from the phone; the live rules accepted it and the officer dashboard updated immediately.</w:t>
+      </w:r>
+    </w:p>
+    <w:p>
+      <w:pPr>
+        <w:pStyle w:val="ListParagraph"/>
+        <w:numPr>
+          <w:ilvl w:val="0"/>
+          <w:numId w:val="3"/>
+        </w:numPr>
+        <w:spacing w:after="60" w:line="288" w:lineRule="auto"/>
+      </w:pPr>
+      <w:r>
+        <w:t>Officer advanced the applicant with a note; the phone received the stage notification and showed the application in progress.</w:t>
+      </w:r>
+    </w:p>
+    <w:p>
+      <w:pPr>
+        <w:pStyle w:val="ListParagraph"/>
+        <w:numPr>
+          <w:ilvl w:val="0"/>
+          <w:numId w:val="3"/>
+        </w:numPr>
+        <w:spacing w:after="60" w:line="288" w:lineRule="auto"/>
+      </w:pPr>
+      <w:r>
+        <w:t>Officer announcement reached the phone through the background sync while the app was closed.</w:t>
+      </w:r>
+    </w:p>
+    <w:p>
+      <w:pPr>
+        <w:pStyle w:val="ListParagraph"/>
+        <w:numPr>
+          <w:ilvl w:val="0"/>
+          <w:numId w:val="3"/>
+        </w:numPr>
+        <w:spacing w:after="60" w:line="288" w:lineRule="auto"/>
+      </w:pPr>
+      <w:r>
+        <w:t>Officer analytics showed the real data, with preparation insights withheld below three students; neither device logged permission, index or crash errors.</w:t>
+      </w:r>
+    </w:p>
+    <w:p>
+      <w:pPr>
         <w:pStyle w:val="Heading2"/>
         <w:keepNext/>
         <w:spacing w:before="200"/>
       </w:pPr>
-      <w:bookmarkStart w:id="37" w:name="_Toc243907530"/>
+      <w:bookmarkStart w:id="37" w:name="_Toc243949495"/>
       <w:r>
         <w:t>5.3 Limitations of Testing</w:t>
       </w:r>
@@ -13396,7 +13560,7 @@
         <w:jc w:val="both"/>
       </w:pPr>
       <w:r>
-        <w:t>The full register-to-apply and officer create-to-publish journeys were tested manually, not as automated Espresso tests. The application has not been run against a production Firebase project or on a physical phone, and no usability study with students was conducted.</w:t>
+        <w:t>The full register-to-apply and officer create-to-publish journeys were tested manually, not as automated Espresso tests. Background notifications on a physical phone can be delayed by Android battery optimisation when the app is closed; they are immediate while the app is open. No usability study with students was conducted.</w:t>
       </w:r>
     </w:p>
     <w:p>
@@ -13404,7 +13568,7 @@
         <w:pStyle w:val="Heading1"/>
         <w:pageBreakBefore/>
       </w:pPr>
-      <w:bookmarkStart w:id="38" w:name="_Toc243907531"/>
+      <w:bookmarkStart w:id="38" w:name="_Toc243949496"/>
       <w:r>
         <w:t>6. Output Screenshots</w:t>
       </w:r>
@@ -13425,7 +13589,7 @@
         <w:keepNext/>
         <w:spacing w:before="200"/>
       </w:pPr>
-      <w:bookmarkStart w:id="39" w:name="_Toc243907532"/>
+      <w:bookmarkStart w:id="39" w:name="_Toc243949497"/>
       <w:r>
         <w:t>6.1 Student Portal</w:t>
       </w:r>
@@ -13478,7 +13642,7 @@
                 <w:noProof/>
               </w:rPr>
               <w:drawing>
-                <wp:inline distT="0" distB="0" distL="0" distR="0" wp14:anchorId="696FCF1A" wp14:editId="01690DCA">
+                <wp:inline distT="0" distB="0" distL="0" distR="0" wp14:anchorId="128D1160" wp14:editId="48E03A95">
                   <wp:extent cx="1619250" cy="3600450"/>
                   <wp:effectExtent l="0" t="0" r="0" b="0"/>
                   <wp:docPr id="9" name="01_onboarding.jpg" descr="Onboarding" title="Onboarding"/>
@@ -13567,7 +13731,7 @@
                 <w:noProof/>
               </w:rPr>
               <w:drawing>
-                <wp:inline distT="0" distB="0" distL="0" distR="0" wp14:anchorId="36429CBB" wp14:editId="34837B11">
+                <wp:inline distT="0" distB="0" distL="0" distR="0" wp14:anchorId="5D34547F" wp14:editId="3B9A7B55">
                   <wp:extent cx="1619250" cy="3600450"/>
                   <wp:effectExtent l="0" t="0" r="0" b="0"/>
                   <wp:docPr id="10" name="02_login.jpg" descr="Sign in" title="Sign in"/>
@@ -13656,7 +13820,7 @@
                 <w:noProof/>
               </w:rPr>
               <w:drawing>
-                <wp:inline distT="0" distB="0" distL="0" distR="0" wp14:anchorId="331504E8" wp14:editId="486A07EE">
+                <wp:inline distT="0" distB="0" distL="0" distR="0" wp14:anchorId="307A34A3" wp14:editId="5B421300">
                   <wp:extent cx="1619250" cy="3600450"/>
                   <wp:effectExtent l="0" t="0" r="0" b="0"/>
                   <wp:docPr id="11" name="03_home.jpg" descr="Student home" title="Student home"/>
@@ -13750,7 +13914,7 @@
                 <w:noProof/>
               </w:rPr>
               <w:drawing>
-                <wp:inline distT="0" distB="0" distL="0" distR="0" wp14:anchorId="26BF1286" wp14:editId="0B366916">
+                <wp:inline distT="0" distB="0" distL="0" distR="0" wp14:anchorId="10DFD346" wp14:editId="75B8E9F6">
                   <wp:extent cx="1619250" cy="3600450"/>
                   <wp:effectExtent l="0" t="0" r="0" b="0"/>
                   <wp:docPr id="12" name="04_next_steps.jpg" descr="Career Action Plan" title="Career Action Plan"/>
@@ -13839,7 +14003,7 @@
                 <w:noProof/>
               </w:rPr>
               <w:drawing>
-                <wp:inline distT="0" distB="0" distL="0" distR="0" wp14:anchorId="416A32A1" wp14:editId="222528D3">
+                <wp:inline distT="0" distB="0" distL="0" distR="0" wp14:anchorId="51F471C9" wp14:editId="29BE09C2">
                   <wp:extent cx="1619250" cy="3600450"/>
                   <wp:effectExtent l="0" t="0" r="0" b="0"/>
                   <wp:docPr id="13" name="05_drives.jpg" descr="Drives with eligibility badges" title="Drives with eligibility badges"/>
@@ -13928,7 +14092,7 @@
                 <w:noProof/>
               </w:rPr>
               <w:drawing>
-                <wp:inline distT="0" distB="0" distL="0" distR="0" wp14:anchorId="069BF46F" wp14:editId="27FCE845">
+                <wp:inline distT="0" distB="0" distL="0" distR="0" wp14:anchorId="7A8913DE" wp14:editId="77CC14EB">
                   <wp:extent cx="1619250" cy="3600450"/>
                   <wp:effectExtent l="0" t="0" r="0" b="0"/>
                   <wp:docPr id="14" name="13_filters.jpg" descr="Filter and sort sheet" title="Filter and sort sheet"/>
@@ -14054,7 +14218,7 @@
                 <w:noProof/>
               </w:rPr>
               <w:drawing>
-                <wp:inline distT="0" distB="0" distL="0" distR="0" wp14:anchorId="2C675D69" wp14:editId="14773D6B">
+                <wp:inline distT="0" distB="0" distL="0" distR="0" wp14:anchorId="6B4B8383" wp14:editId="4B013A71">
                   <wp:extent cx="1619250" cy="3600450"/>
                   <wp:effectExtent l="0" t="0" r="0" b="0"/>
                   <wp:docPr id="15" name="06_drive_eligibility.jpg" descr="Explainable eligibility" title="Explainable eligibility"/>
@@ -14143,7 +14307,7 @@
                 <w:noProof/>
               </w:rPr>
               <w:drawing>
-                <wp:inline distT="0" distB="0" distL="0" distR="0" wp14:anchorId="3D7BF528" wp14:editId="5778DDB7">
+                <wp:inline distT="0" distB="0" distL="0" distR="0" wp14:anchorId="092BD2A7" wp14:editId="713CFCB9">
                   <wp:extent cx="1619250" cy="3600450"/>
                   <wp:effectExtent l="0" t="0" r="0" b="0"/>
                   <wp:docPr id="16" name="07_match_score.jpg" descr="Explainable match score" title="Explainable match score"/>
@@ -14232,7 +14396,7 @@
                 <w:noProof/>
               </w:rPr>
               <w:drawing>
-                <wp:inline distT="0" distB="0" distL="0" distR="0" wp14:anchorId="52DE9BAF" wp14:editId="4107591F">
+                <wp:inline distT="0" distB="0" distL="0" distR="0" wp14:anchorId="4BB83DEB" wp14:editId="762C2BD2">
                   <wp:extent cx="1619250" cy="3600450"/>
                   <wp:effectExtent l="0" t="0" r="0" b="0"/>
                   <wp:docPr id="17" name="14_not_eligible_rahul.jpg" descr="Not eligible: CGPA 6.99" title="Not eligible: CGPA 6.99"/>
@@ -14326,7 +14490,7 @@
                 <w:noProof/>
               </w:rPr>
               <w:drawing>
-                <wp:inline distT="0" distB="0" distL="0" distR="0" wp14:anchorId="51F2DE37" wp14:editId="6D43C9A8">
+                <wp:inline distT="0" distB="0" distL="0" distR="0" wp14:anchorId="179A141F" wp14:editId="0D02B46B">
                   <wp:extent cx="1619250" cy="3600450"/>
                   <wp:effectExtent l="0" t="0" r="0" b="0"/>
                   <wp:docPr id="18" name="15_kiran_verification.jpg" descr="Unverified student plan" title="Unverified student plan"/>
@@ -14415,7 +14579,7 @@
                 <w:noProof/>
               </w:rPr>
               <w:drawing>
-                <wp:inline distT="0" distB="0" distL="0" distR="0" wp14:anchorId="5C9C1E87" wp14:editId="6C4BFB7B">
+                <wp:inline distT="0" distB="0" distL="0" distR="0" wp14:anchorId="3BD02777" wp14:editId="3B86DBB8">
                   <wp:extent cx="1619250" cy="3600450"/>
                   <wp:effectExtent l="0" t="0" r="0" b="0"/>
                   <wp:docPr id="19" name="08_applications.jpg" descr="Applications" title="Applications"/>
@@ -14504,7 +14668,7 @@
                 <w:noProof/>
               </w:rPr>
               <w:drawing>
-                <wp:inline distT="0" distB="0" distL="0" distR="0" wp14:anchorId="39FB80BD" wp14:editId="0086B199">
+                <wp:inline distT="0" distB="0" distL="0" distR="0" wp14:anchorId="3FA7F35E" wp14:editId="2930289A">
                   <wp:extent cx="1619250" cy="3600450"/>
                   <wp:effectExtent l="0" t="0" r="0" b="0"/>
                   <wp:docPr id="20" name="09_journey.jpg" descr="Recruitment journey" title="Recruitment journey"/>
@@ -14630,7 +14794,7 @@
                 <w:noProof/>
               </w:rPr>
               <w:drawing>
-                <wp:inline distT="0" distB="0" distL="0" distR="0" wp14:anchorId="4A57F361" wp14:editId="2B209DF1">
+                <wp:inline distT="0" distB="0" distL="0" distR="0" wp14:anchorId="3792726A" wp14:editId="083C1784">
                   <wp:extent cx="1619250" cy="3600450"/>
                   <wp:effectExtent l="0" t="0" r="0" b="0"/>
                   <wp:docPr id="21" name="10_readiness.jpg" descr="Readiness dashboard" title="Readiness dashboard"/>
@@ -14719,7 +14883,7 @@
                 <w:noProof/>
               </w:rPr>
               <w:drawing>
-                <wp:inline distT="0" distB="0" distL="0" distR="0" wp14:anchorId="1D57F35B" wp14:editId="521FA480">
+                <wp:inline distT="0" distB="0" distL="0" distR="0" wp14:anchorId="045ECF9D" wp14:editId="444F7767">
                   <wp:extent cx="1619250" cy="3600450"/>
                   <wp:effectExtent l="0" t="0" r="0" b="0"/>
                   <wp:docPr id="22" name="11_readiness_suggestions.jpg" descr="Suggestions and relevant drives" title="Suggestions and relevant drives"/>
@@ -14808,7 +14972,7 @@
                 <w:noProof/>
               </w:rPr>
               <w:drawing>
-                <wp:inline distT="0" distB="0" distL="0" distR="0" wp14:anchorId="22F6B66B" wp14:editId="6DC0DA45">
+                <wp:inline distT="0" distB="0" distL="0" distR="0" wp14:anchorId="37A47B31" wp14:editId="3C16D94C">
                   <wp:extent cx="1619250" cy="3600450"/>
                   <wp:effectExtent l="0" t="0" r="0" b="0"/>
                   <wp:docPr id="23" name="12_profile.jpg" descr="Profile with locked academic record" title="Profile with locked academic record"/>
@@ -14893,7 +15057,7 @@
         <w:keepNext/>
         <w:spacing w:before="200"/>
       </w:pPr>
-      <w:bookmarkStart w:id="40" w:name="_Toc243907533"/>
+      <w:bookmarkStart w:id="40" w:name="_Toc243949498"/>
       <w:r>
         <w:t>6.2 Placement Officer Portal</w:t>
       </w:r>
@@ -14946,7 +15110,7 @@
                 <w:noProof/>
               </w:rPr>
               <w:drawing>
-                <wp:inline distT="0" distB="0" distL="0" distR="0" wp14:anchorId="1A827A23" wp14:editId="1A9447F1">
+                <wp:inline distT="0" distB="0" distL="0" distR="0" wp14:anchorId="539B11EC" wp14:editId="7F0B785A">
                   <wp:extent cx="1619250" cy="3600450"/>
                   <wp:effectExtent l="0" t="0" r="0" b="0"/>
                   <wp:docPr id="24" name="16_officer_dashboard.jpg" descr="Officer dashboard" title="Officer dashboard"/>
@@ -15035,7 +15199,7 @@
                 <w:noProof/>
               </w:rPr>
               <w:drawing>
-                <wp:inline distT="0" distB="0" distL="0" distR="0" wp14:anchorId="45989702" wp14:editId="09E5F2E2">
+                <wp:inline distT="0" distB="0" distL="0" distR="0" wp14:anchorId="76150AEE" wp14:editId="20513E94">
                   <wp:extent cx="1619250" cy="3600450"/>
                   <wp:effectExtent l="0" t="0" r="0" b="0"/>
                   <wp:docPr id="25" name="17_verify_queue.jpg" descr="Verification queue" title="Verification queue"/>
@@ -15124,7 +15288,7 @@
                 <w:noProof/>
               </w:rPr>
               <w:drawing>
-                <wp:inline distT="0" distB="0" distL="0" distR="0" wp14:anchorId="55A382B2" wp14:editId="7CD9C226">
+                <wp:inline distT="0" distB="0" distL="0" distR="0" wp14:anchorId="67DA7FD1" wp14:editId="44665CC7">
                   <wp:extent cx="1619250" cy="3600450"/>
                   <wp:effectExtent l="0" t="0" r="0" b="0"/>
                   <wp:docPr id="26" name="18_verify_review.jpg" descr="Record review dialog" title="Record review dialog"/>
@@ -15218,7 +15382,7 @@
                 <w:noProof/>
               </w:rPr>
               <w:drawing>
-                <wp:inline distT="0" distB="0" distL="0" distR="0" wp14:anchorId="48FA23B1" wp14:editId="3F3808C1">
+                <wp:inline distT="0" distB="0" distL="0" distR="0" wp14:anchorId="26020EB1" wp14:editId="37FA7252">
                   <wp:extent cx="1619250" cy="3600450"/>
                   <wp:effectExtent l="0" t="0" r="0" b="0"/>
                   <wp:docPr id="27" name="19_officer_drives.jpg" descr="Placement drives" title="Placement drives"/>
@@ -15307,7 +15471,7 @@
                 <w:noProof/>
               </w:rPr>
               <w:drawing>
-                <wp:inline distT="0" distB="0" distL="0" distR="0" wp14:anchorId="63B4AA94" wp14:editId="2500E122">
+                <wp:inline distT="0" distB="0" distL="0" distR="0" wp14:anchorId="1E007B59" wp14:editId="1388CAB8">
                   <wp:extent cx="1619250" cy="3600450"/>
                   <wp:effectExtent l="0" t="0" r="0" b="0"/>
                   <wp:docPr id="28" name="20_applicants.jpg" descr="Applicants for a drive" title="Applicants for a drive"/>
@@ -15396,7 +15560,7 @@
                 <w:noProof/>
               </w:rPr>
               <w:drawing>
-                <wp:inline distT="0" distB="0" distL="0" distR="0" wp14:anchorId="2DC9A860" wp14:editId="2C4D283E">
+                <wp:inline distT="0" distB="0" distL="0" distR="0" wp14:anchorId="01D5AFF7" wp14:editId="7DCC5644">
                   <wp:extent cx="1619250" cy="3600450"/>
                   <wp:effectExtent l="0" t="0" r="0" b="0"/>
                   <wp:docPr id="29" name="21_applicant_detail.jpg" descr="Applicant detail with actions" title="Applicant detail with actions"/>
@@ -15522,7 +15686,7 @@
                 <w:noProof/>
               </w:rPr>
               <w:drawing>
-                <wp:inline distT="0" distB="0" distL="0" distR="0" wp14:anchorId="270DA34C" wp14:editId="513E6D1B">
+                <wp:inline distT="0" distB="0" distL="0" distR="0" wp14:anchorId="2316701C" wp14:editId="2ED7A0E3">
                   <wp:extent cx="1619250" cy="3600450"/>
                   <wp:effectExtent l="0" t="0" r="0" b="0"/>
                   <wp:docPr id="30" name="22_drive_editor.jpg" descr="Drive editor" title="Drive editor"/>
@@ -15611,7 +15775,7 @@
                 <w:noProof/>
               </w:rPr>
               <w:drawing>
-                <wp:inline distT="0" distB="0" distL="0" distR="0" wp14:anchorId="62EC7E1F" wp14:editId="25AF58E2">
+                <wp:inline distT="0" distB="0" distL="0" distR="0" wp14:anchorId="2143FF94" wp14:editId="48B0A5CF">
                   <wp:extent cx="1619250" cy="3600450"/>
                   <wp:effectExtent l="0" t="0" r="0" b="0"/>
                   <wp:docPr id="31" name="23_drive_editor_stages.jpg" descr="Stage schedules" title="Stage schedules"/>
@@ -15700,7 +15864,7 @@
                 <w:noProof/>
               </w:rPr>
               <w:drawing>
-                <wp:inline distT="0" distB="0" distL="0" distR="0" wp14:anchorId="52F1A5F9" wp14:editId="1B79336D">
+                <wp:inline distT="0" distB="0" distL="0" distR="0" wp14:anchorId="3BD5D642" wp14:editId="15897693">
                   <wp:extent cx="1619250" cy="3600450"/>
                   <wp:effectExtent l="0" t="0" r="0" b="0"/>
                   <wp:docPr id="32" name="24_announcements.jpg" descr="Announcements" title="Announcements"/>
@@ -15794,7 +15958,7 @@
                 <w:noProof/>
               </w:rPr>
               <w:drawing>
-                <wp:inline distT="0" distB="0" distL="0" distR="0" wp14:anchorId="13B69AA4" wp14:editId="5F574856">
+                <wp:inline distT="0" distB="0" distL="0" distR="0" wp14:anchorId="55969BA6" wp14:editId="0DDE1CA1">
                   <wp:extent cx="1619250" cy="3600450"/>
                   <wp:effectExtent l="0" t="0" r="0" b="0"/>
                   <wp:docPr id="33" name="25_analytics.jpg" descr="Analytics: per drive and funnel" title="Analytics: per drive and funnel"/>
@@ -15883,7 +16047,7 @@
                 <w:noProof/>
               </w:rPr>
               <w:drawing>
-                <wp:inline distT="0" distB="0" distL="0" distR="0" wp14:anchorId="327F0560" wp14:editId="4DFE1090">
+                <wp:inline distT="0" distB="0" distL="0" distR="0" wp14:anchorId="1CFD007E" wp14:editId="31089780">
                   <wp:extent cx="1619250" cy="3600450"/>
                   <wp:effectExtent l="0" t="0" r="0" b="0"/>
                   <wp:docPr id="34" name="26_prep_insights.jpg" descr="Preparation insights" title="Preparation insights"/>
@@ -15976,26 +16140,15 @@
     </w:p>
     <w:p>
       <w:pPr>
-        <w:pStyle w:val="Heading1"/>
-        <w:pageBreakBefore/>
-      </w:pPr>
-      <w:bookmarkStart w:id="41" w:name="_Toc243907534"/>
-      <w:r>
-        <w:t>7. Conclusion and Future Scope</w:t>
-      </w:r>
-      <w:bookmarkEnd w:id="41"/>
-    </w:p>
-    <w:p>
-      <w:pPr>
         <w:pStyle w:val="Heading2"/>
         <w:keepNext/>
         <w:spacing w:before="200"/>
       </w:pPr>
-      <w:bookmarkStart w:id="42" w:name="_Toc243907535"/>
-      <w:r>
-        <w:t>7.1 Conclusion</w:t>
-      </w:r>
-      <w:bookmarkEnd w:id="42"/>
+      <w:bookmarkStart w:id="41" w:name="_Toc243949499"/>
+      <w:r>
+        <w:t>6.3 Live Deployment</w:t>
+      </w:r>
+      <w:bookmarkEnd w:id="41"/>
     </w:p>
     <w:p>
       <w:pPr>
@@ -16003,11 +16156,327 @@
         <w:jc w:val="both"/>
       </w:pPr>
       <w:r>
-        <w:t>NEXORA delivers a complete campus placement workflow on Android using Java and XML. Its distinctive contribution is explainability combined with server-side trust: students see precisely why they are eligible or not, why a drive is ranked as it is and what to do next, while the Firestore Security Rules ensure that roles, verification, eligibility, deadlines, duplicate prevention and recruitment outcomes cannot be bypassed by a modified client. The Career Action Engine connects the eligibility, ranking, read</w:t>
-      </w:r>
-      <w:r>
-        <w:t>iness and recruitment features into one guided workflow, and the officer portal turns the same data into actionable, privacy-preserving analytics. The domain logic is fully separated from Android and Firebase and is verified by automated tests, and the whole system runs on the free Firebase Spark plan with offline support.</w:t>
-      </w:r>
+        <w:rPr>
+          <w:sz w:val="22"/>
+          <w:szCs w:val="22"/>
+        </w:rPr>
+        <w:t>These screenshots come from the live Firebase project: the student portal on a physical phone (dark theme) and the officer portal on the emulator.</w:t>
+      </w:r>
+    </w:p>
+    <w:tbl>
+      <w:tblPr>
+        <w:tblW w:w="9024" w:type="dxa"/>
+        <w:tblBorders>
+          <w:top w:val="single" w:sz="4" w:space="0" w:color="auto"/>
+          <w:left w:val="single" w:sz="4" w:space="0" w:color="auto"/>
+          <w:bottom w:val="single" w:sz="4" w:space="0" w:color="auto"/>
+          <w:right w:val="single" w:sz="4" w:space="0" w:color="auto"/>
+          <w:insideH w:val="single" w:sz="4" w:space="0" w:color="auto"/>
+          <w:insideV w:val="single" w:sz="4" w:space="0" w:color="auto"/>
+        </w:tblBorders>
+        <w:tblLook w:val="04A0" w:firstRow="1" w:lastRow="0" w:firstColumn="1" w:lastColumn="0" w:noHBand="0" w:noVBand="1"/>
+      </w:tblPr>
+      <w:tblGrid>
+        <w:gridCol w:w="3008"/>
+        <w:gridCol w:w="3008"/>
+        <w:gridCol w:w="3008"/>
+      </w:tblGrid>
+      <w:tr>
+        <w:trPr>
+          <w:cantSplit/>
+        </w:trPr>
+        <w:tc>
+          <w:tcPr>
+            <w:tcW w:w="3008" w:type="dxa"/>
+            <w:tcBorders>
+              <w:top w:val="none" w:sz="0" w:space="0" w:color="FFFFFF"/>
+              <w:left w:val="none" w:sz="0" w:space="0" w:color="FFFFFF"/>
+              <w:bottom w:val="none" w:sz="0" w:space="0" w:color="FFFFFF"/>
+              <w:right w:val="none" w:sz="0" w:space="0" w:color="FFFFFF"/>
+            </w:tcBorders>
+            <w:tcMar>
+              <w:top w:w="60" w:type="dxa"/>
+              <w:left w:w="60" w:type="dxa"/>
+              <w:bottom w:w="60" w:type="dxa"/>
+              <w:right w:w="60" w:type="dxa"/>
+            </w:tcMar>
+          </w:tcPr>
+          <w:p>
+            <w:pPr>
+              <w:jc w:val="center"/>
+            </w:pPr>
+            <w:r>
+              <w:rPr>
+                <w:noProof/>
+              </w:rPr>
+              <w:drawing>
+                <wp:inline distT="0" distB="0" distL="0" distR="0" wp14:anchorId="31A8C60B" wp14:editId="32C264D8">
+                  <wp:extent cx="1619250" cy="3600450"/>
+                  <wp:effectExtent l="0" t="0" r="0" b="0"/>
+                  <wp:docPr id="35" name="30_ph_detail.jpg" descr="Phone: live drive, Eligible" title="Phone: live drive, Eligible"/>
+                  <wp:cNvGraphicFramePr>
+                    <a:graphicFrameLocks xmlns:a="http://schemas.openxmlformats.org/drawingml/2006/main" noChangeAspect="1"/>
+                  </wp:cNvGraphicFramePr>
+                  <a:graphic xmlns:a="http://schemas.openxmlformats.org/drawingml/2006/main">
+                    <a:graphicData uri="http://schemas.openxmlformats.org/drawingml/2006/picture">
+                      <pic:pic xmlns:pic="http://schemas.openxmlformats.org/drawingml/2006/picture">
+                        <pic:nvPicPr>
+                          <pic:cNvPr id="0" name=""/>
+                          <pic:cNvPicPr>
+                            <a:picLocks noChangeAspect="1" noChangeArrowheads="1"/>
+                          </pic:cNvPicPr>
+                        </pic:nvPicPr>
+                        <pic:blipFill>
+                          <a:blip r:embed="rId43"/>
+                          <a:srcRect/>
+                          <a:stretch>
+                            <a:fillRect/>
+                          </a:stretch>
+                        </pic:blipFill>
+                        <pic:spPr bwMode="auto">
+                          <a:xfrm>
+                            <a:off x="0" y="0"/>
+                            <a:ext cx="1619250" cy="3600450"/>
+                          </a:xfrm>
+                          <a:prstGeom prst="rect">
+                            <a:avLst/>
+                          </a:prstGeom>
+                        </pic:spPr>
+                      </pic:pic>
+                    </a:graphicData>
+                  </a:graphic>
+                </wp:inline>
+              </w:drawing>
+            </w:r>
+          </w:p>
+          <w:p>
+            <w:pPr>
+              <w:spacing w:before="60" w:after="120"/>
+              <w:jc w:val="center"/>
+            </w:pPr>
+            <w:r>
+              <w:rPr>
+                <w:b/>
+                <w:bCs/>
+                <w:sz w:val="18"/>
+                <w:szCs w:val="18"/>
+              </w:rPr>
+              <w:t xml:space="preserve">Figure 34: </w:t>
+            </w:r>
+            <w:r>
+              <w:rPr>
+                <w:i/>
+                <w:iCs/>
+                <w:sz w:val="18"/>
+                <w:szCs w:val="18"/>
+              </w:rPr>
+              <w:t>Phone: live drive, Eligible</w:t>
+            </w:r>
+          </w:p>
+        </w:tc>
+        <w:tc>
+          <w:tcPr>
+            <w:tcW w:w="3008" w:type="dxa"/>
+            <w:tcBorders>
+              <w:top w:val="none" w:sz="0" w:space="0" w:color="FFFFFF"/>
+              <w:left w:val="none" w:sz="0" w:space="0" w:color="FFFFFF"/>
+              <w:bottom w:val="none" w:sz="0" w:space="0" w:color="FFFFFF"/>
+              <w:right w:val="none" w:sz="0" w:space="0" w:color="FFFFFF"/>
+            </w:tcBorders>
+            <w:tcMar>
+              <w:top w:w="60" w:type="dxa"/>
+              <w:left w:w="60" w:type="dxa"/>
+              <w:bottom w:w="60" w:type="dxa"/>
+              <w:right w:w="60" w:type="dxa"/>
+            </w:tcMar>
+          </w:tcPr>
+          <w:p>
+            <w:pPr>
+              <w:jc w:val="center"/>
+            </w:pPr>
+            <w:r>
+              <w:rPr>
+                <w:noProof/>
+              </w:rPr>
+              <w:drawing>
+                <wp:inline distT="0" distB="0" distL="0" distR="0" wp14:anchorId="66A38BEE" wp14:editId="2B3C2505">
+                  <wp:extent cx="1619250" cy="3600450"/>
+                  <wp:effectExtent l="0" t="0" r="0" b="0"/>
+                  <wp:docPr id="36" name="30_ph_match.jpg" descr="Phone: live match score" title="Phone: live match score"/>
+                  <wp:cNvGraphicFramePr>
+                    <a:graphicFrameLocks xmlns:a="http://schemas.openxmlformats.org/drawingml/2006/main" noChangeAspect="1"/>
+                  </wp:cNvGraphicFramePr>
+                  <a:graphic xmlns:a="http://schemas.openxmlformats.org/drawingml/2006/main">
+                    <a:graphicData uri="http://schemas.openxmlformats.org/drawingml/2006/picture">
+                      <pic:pic xmlns:pic="http://schemas.openxmlformats.org/drawingml/2006/picture">
+                        <pic:nvPicPr>
+                          <pic:cNvPr id="0" name=""/>
+                          <pic:cNvPicPr>
+                            <a:picLocks noChangeAspect="1" noChangeArrowheads="1"/>
+                          </pic:cNvPicPr>
+                        </pic:nvPicPr>
+                        <pic:blipFill>
+                          <a:blip r:embed="rId44"/>
+                          <a:srcRect/>
+                          <a:stretch>
+                            <a:fillRect/>
+                          </a:stretch>
+                        </pic:blipFill>
+                        <pic:spPr bwMode="auto">
+                          <a:xfrm>
+                            <a:off x="0" y="0"/>
+                            <a:ext cx="1619250" cy="3600450"/>
+                          </a:xfrm>
+                          <a:prstGeom prst="rect">
+                            <a:avLst/>
+                          </a:prstGeom>
+                        </pic:spPr>
+                      </pic:pic>
+                    </a:graphicData>
+                  </a:graphic>
+                </wp:inline>
+              </w:drawing>
+            </w:r>
+          </w:p>
+          <w:p>
+            <w:pPr>
+              <w:spacing w:before="60" w:after="120"/>
+              <w:jc w:val="center"/>
+            </w:pPr>
+            <w:r>
+              <w:rPr>
+                <w:b/>
+                <w:bCs/>
+                <w:sz w:val="18"/>
+                <w:szCs w:val="18"/>
+              </w:rPr>
+              <w:t xml:space="preserve">Figure 35: </w:t>
+            </w:r>
+            <w:r>
+              <w:rPr>
+                <w:i/>
+                <w:iCs/>
+                <w:sz w:val="18"/>
+                <w:szCs w:val="18"/>
+              </w:rPr>
+              <w:t>Phone: live match score</w:t>
+            </w:r>
+          </w:p>
+        </w:tc>
+        <w:tc>
+          <w:tcPr>
+            <w:tcW w:w="3008" w:type="dxa"/>
+            <w:tcBorders>
+              <w:top w:val="none" w:sz="0" w:space="0" w:color="FFFFFF"/>
+              <w:left w:val="none" w:sz="0" w:space="0" w:color="FFFFFF"/>
+              <w:bottom w:val="none" w:sz="0" w:space="0" w:color="FFFFFF"/>
+              <w:right w:val="none" w:sz="0" w:space="0" w:color="FFFFFF"/>
+            </w:tcBorders>
+            <w:tcMar>
+              <w:top w:w="60" w:type="dxa"/>
+              <w:left w:w="60" w:type="dxa"/>
+              <w:bottom w:w="60" w:type="dxa"/>
+              <w:right w:w="60" w:type="dxa"/>
+            </w:tcMar>
+          </w:tcPr>
+          <w:p>
+            <w:pPr>
+              <w:jc w:val="center"/>
+            </w:pPr>
+            <w:r>
+              <w:rPr>
+                <w:noProof/>
+              </w:rPr>
+              <w:drawing>
+                <wp:inline distT="0" distB="0" distL="0" distR="0" wp14:anchorId="3D64F873" wp14:editId="659C2021">
+                  <wp:extent cx="1619250" cy="3600450"/>
+                  <wp:effectExtent l="0" t="0" r="0" b="0"/>
+                  <wp:docPr id="37" name="32_live_officer.jpg" descr="Emulator: live officer dashboard" title="Emulator: live officer dashboard"/>
+                  <wp:cNvGraphicFramePr>
+                    <a:graphicFrameLocks xmlns:a="http://schemas.openxmlformats.org/drawingml/2006/main" noChangeAspect="1"/>
+                  </wp:cNvGraphicFramePr>
+                  <a:graphic xmlns:a="http://schemas.openxmlformats.org/drawingml/2006/main">
+                    <a:graphicData uri="http://schemas.openxmlformats.org/drawingml/2006/picture">
+                      <pic:pic xmlns:pic="http://schemas.openxmlformats.org/drawingml/2006/picture">
+                        <pic:nvPicPr>
+                          <pic:cNvPr id="0" name=""/>
+                          <pic:cNvPicPr>
+                            <a:picLocks noChangeAspect="1" noChangeArrowheads="1"/>
+                          </pic:cNvPicPr>
+                        </pic:nvPicPr>
+                        <pic:blipFill>
+                          <a:blip r:embed="rId45"/>
+                          <a:srcRect/>
+                          <a:stretch>
+                            <a:fillRect/>
+                          </a:stretch>
+                        </pic:blipFill>
+                        <pic:spPr bwMode="auto">
+                          <a:xfrm>
+                            <a:off x="0" y="0"/>
+                            <a:ext cx="1619250" cy="3600450"/>
+                          </a:xfrm>
+                          <a:prstGeom prst="rect">
+                            <a:avLst/>
+                          </a:prstGeom>
+                        </pic:spPr>
+                      </pic:pic>
+                    </a:graphicData>
+                  </a:graphic>
+                </wp:inline>
+              </w:drawing>
+            </w:r>
+          </w:p>
+          <w:p>
+            <w:pPr>
+              <w:spacing w:before="60" w:after="120"/>
+              <w:jc w:val="center"/>
+            </w:pPr>
+            <w:r>
+              <w:rPr>
+                <w:b/>
+                <w:bCs/>
+                <w:sz w:val="18"/>
+                <w:szCs w:val="18"/>
+              </w:rPr>
+              <w:t xml:space="preserve">Figure 36: </w:t>
+            </w:r>
+            <w:r>
+              <w:rPr>
+                <w:i/>
+                <w:iCs/>
+                <w:sz w:val="18"/>
+                <w:szCs w:val="18"/>
+              </w:rPr>
+              <w:t>Emulator: live officer dashboard</w:t>
+            </w:r>
+          </w:p>
+        </w:tc>
+      </w:tr>
+    </w:tbl>
+    <w:p>
+      <w:pPr>
+        <w:spacing w:before="120" w:after="120" w:line="300" w:lineRule="auto"/>
+        <w:jc w:val="both"/>
+      </w:pPr>
+      <w:r>
+        <w:rPr>
+          <w:sz w:val="22"/>
+          <w:szCs w:val="22"/>
+        </w:rPr>
+        <w:t>Figures 34–36: after the officer verified the student, the phone showed the drive as Eligible with a 65% match, and the officer dashboard counted the live drive and application.</w:t>
+      </w:r>
+    </w:p>
+    <w:p>
+      <w:pPr>
+        <w:pStyle w:val="Heading1"/>
+        <w:pageBreakBefore/>
+      </w:pPr>
+      <w:bookmarkStart w:id="42" w:name="_Toc243949500"/>
+      <w:r>
+        <w:t>7. Conclusion and Future Scope</w:t>
+      </w:r>
+      <w:bookmarkEnd w:id="42"/>
     </w:p>
     <w:p>
       <w:pPr>
@@ -16015,11 +16484,35 @@
         <w:keepNext/>
         <w:spacing w:before="200"/>
       </w:pPr>
-      <w:bookmarkStart w:id="43" w:name="_Toc243907536"/>
+      <w:bookmarkStart w:id="43" w:name="_Toc243949501"/>
+      <w:r>
+        <w:t>7.1 Conclusion</w:t>
+      </w:r>
+      <w:bookmarkEnd w:id="43"/>
+    </w:p>
+    <w:p>
+      <w:pPr>
+        <w:spacing w:after="120" w:line="300" w:lineRule="auto"/>
+        <w:jc w:val="both"/>
+      </w:pPr>
+      <w:r>
+        <w:t>NEXORA delivers a complete campus placement workflow on Android using Java and XML. Its distinctive contribution is explainability combined with server-side trust: students see precisely why they are eligible or not, why a drive is ranked as it is and what to do next, while the Firestore Security Rules ensure that roles, verification, eligibility, deadlines, duplicate prevention and recruitment outcomes cannot be bypassed by a modified client. The Career Action Engine connects the eligibility, ranking, read</w:t>
+      </w:r>
+      <w:r>
+        <w:t>iness and recruitment features into one guided workflow, and the officer portal turns the same data into actionable, privacy-preserving analytics. The domain logic is fully separated from Android and Firebase and is verified by automated tests, and the whole system runs on the free Firebase Spark plan with offline support. The application is deployed on a live Firebase project and was demonstrated across two devices.</w:t>
+      </w:r>
+    </w:p>
+    <w:p>
+      <w:pPr>
+        <w:pStyle w:val="Heading2"/>
+        <w:keepNext/>
+        <w:spacing w:before="200"/>
+      </w:pPr>
+      <w:bookmarkStart w:id="44" w:name="_Toc243949502"/>
       <w:r>
         <w:t>7.2 Future Scope</w:t>
       </w:r>
-      <w:bookmarkEnd w:id="43"/>
+      <w:bookmarkEnd w:id="44"/>
     </w:p>
     <w:p>
       <w:pPr>
@@ -16031,7 +16524,7 @@
         <w:spacing w:after="60" w:line="288" w:lineRule="auto"/>
       </w:pPr>
       <w:r>
-        <w:t>Officer-configurable match-score weights and readiness targets stored in Firestore.</w:t>
+        <w:t>An officer approval step instead of open officer sign-up.</w:t>
       </w:r>
     </w:p>
     <w:p>
@@ -16044,7 +16537,7 @@
         <w:spacing w:after="60" w:line="288" w:lineRule="auto"/>
       </w:pPr>
       <w:r>
-        <w:t>Instant push notifications through a trusted server (for example Cloud Functions on the paid plan).</w:t>
+        <w:t>Officer-configurable match-score weights and readiness targets stored in Firestore.</w:t>
       </w:r>
     </w:p>
     <w:p>
@@ -16057,7 +16550,7 @@
         <w:spacing w:after="60" w:line="288" w:lineRule="auto"/>
       </w:pPr>
       <w:r>
-        <w:t>Resume upload and parsing, and verified skill assessments instead of self-logged practice.</w:t>
+        <w:t>Instant push notifications through a trusted server (for example Cloud Functions on the paid plan).</w:t>
       </w:r>
     </w:p>
     <w:p>
@@ -16070,7 +16563,7 @@
         <w:spacing w:after="60" w:line="288" w:lineRule="auto"/>
       </w:pPr>
       <w:r>
-        <w:t>Automated end-to-end Espresso journeys and a usability study with students.</w:t>
+        <w:t>Resume upload and parsing, and verified skill assessments instead of self-logged practice.</w:t>
       </w:r>
     </w:p>
     <w:p>
@@ -16083,7 +16576,7 @@
         <w:spacing w:after="60" w:line="288" w:lineRule="auto"/>
       </w:pPr>
       <w:r>
-        <w:t>Calendar integration for recruitment rounds and export of applicant lists.</w:t>
+        <w:t>Automated end-to-end Espresso journeys and a usability study with students.</w:t>
       </w:r>
     </w:p>
     <w:p>
@@ -16096,6 +16589,19 @@
         <w:spacing w:after="60" w:line="288" w:lineRule="auto"/>
       </w:pPr>
       <w:r>
+        <w:t>Calendar integration for recruitment rounds and export of applicant lists.</w:t>
+      </w:r>
+    </w:p>
+    <w:p>
+      <w:pPr>
+        <w:pStyle w:val="ListParagraph"/>
+        <w:numPr>
+          <w:ilvl w:val="0"/>
+          <w:numId w:val="3"/>
+        </w:numPr>
+        <w:spacing w:after="60" w:line="288" w:lineRule="auto"/>
+      </w:pPr>
+      <w:r>
         <w:t>A web dashboard for placement officers and multi-campus scaling of the analytics.</w:t>
       </w:r>
     </w:p>
@@ -16104,11 +16610,11 @@
         <w:pStyle w:val="Heading1"/>
         <w:pageBreakBefore/>
       </w:pPr>
-      <w:bookmarkStart w:id="44" w:name="_Toc243907537"/>
+      <w:bookmarkStart w:id="45" w:name="_Toc243949503"/>
       <w:r>
         <w:t>8. References</w:t>
       </w:r>
-      <w:bookmarkEnd w:id="44"/>
+      <w:bookmarkEnd w:id="45"/>
     </w:p>
     <w:p>
       <w:pPr>
@@ -16958,11 +17464,11 @@
         <w:pStyle w:val="Heading1"/>
         <w:pageBreakBefore/>
       </w:pPr>
-      <w:bookmarkStart w:id="45" w:name="_Toc243907538"/>
+      <w:bookmarkStart w:id="46" w:name="_Toc243949504"/>
       <w:r>
         <w:t>9. Appendix</w:t>
       </w:r>
-      <w:bookmarkEnd w:id="45"/>
+      <w:bookmarkEnd w:id="46"/>
     </w:p>
     <w:p>
       <w:pPr>
@@ -16970,11 +17476,11 @@
         <w:keepNext/>
         <w:spacing w:before="200"/>
       </w:pPr>
-      <w:bookmarkStart w:id="46" w:name="_Toc243907539"/>
+      <w:bookmarkStart w:id="47" w:name="_Toc243949505"/>
       <w:r>
         <w:t>A. Build, Run and Test Commands</w:t>
       </w:r>
-      <w:bookmarkEnd w:id="46"/>
+      <w:bookmarkEnd w:id="47"/>
     </w:p>
     <w:p>
       <w:pPr>
@@ -17058,7 +17564,7 @@
           <w:sz w:val="15"/>
           <w:szCs w:val="15"/>
         </w:rPr>
-        <w:t>./gradlew installDebug               # debug build points to the emulator (10.0.2.2)</w:t>
+        <w:t>./gradlew installDebug               # live project when app/google-services.json exists</w:t>
       </w:r>
     </w:p>
     <w:p>
@@ -17116,11 +17622,11 @@
         <w:keepNext/>
         <w:spacing w:before="200"/>
       </w:pPr>
-      <w:bookmarkStart w:id="47" w:name="_Toc243907540"/>
+      <w:bookmarkStart w:id="48" w:name="_Toc243949506"/>
       <w:r>
         <w:t>B. Source File Inventory</w:t>
       </w:r>
-      <w:bookmarkEnd w:id="47"/>
+      <w:bookmarkEnd w:id="48"/>
     </w:p>
     <w:tbl>
       <w:tblPr>
@@ -17545,11 +18051,11 @@
         <w:keepNext/>
         <w:spacing w:before="200"/>
       </w:pPr>
-      <w:bookmarkStart w:id="48" w:name="_Toc243907541"/>
+      <w:bookmarkStart w:id="49" w:name="_Toc243949507"/>
       <w:r>
         <w:t>C. Configuration and Security Notes</w:t>
       </w:r>
-      <w:bookmarkEnd w:id="48"/>
+      <w:bookmarkEnd w:id="49"/>
     </w:p>
     <w:p>
       <w:pPr>
@@ -17557,11 +18063,11 @@
         <w:jc w:val="both"/>
       </w:pPr>
       <w:r>
-        <w:t>google-services.json, service-account keys and local.properties are excluded from version control. Debug builds need no Firebase credentials because they use the Emulator Suite. Demo account passwords are defined in the seed script and are intentionally not reproduced in this report.</w:t>
+        <w:t>google-services.json, service-account keys and local.properties are excluded from version control. With google-services.json in app/, builds use the live project; without it, debug builds need no credentials because they use the Emulator Suite. Demo account passwords are defined in the seed script and are intentionally not reproduced in this report.</w:t>
       </w:r>
     </w:p>
     <w:sectPr>
-      <w:footerReference w:type="default" r:id="rId43"/>
+      <w:footerReference w:type="default" r:id="rId46"/>
       <w:pgSz w:w="11906" w:h="16838"/>
       <w:pgMar w:top="1440" w:right="1440" w:bottom="1300" w:left="1440" w:header="708" w:footer="708" w:gutter="0"/>
       <w:cols w:space="720"/>
@@ -17728,7 +18234,7 @@
         <w:sz w:val="18"/>
         <w:szCs w:val="18"/>
       </w:rPr>
-      <w:t>11</w:t>
+      <w:t>12</w:t>
     </w:r>
     <w:r>
       <w:rPr>
@@ -17804,7 +18310,7 @@
         <w:sz w:val="18"/>
         <w:szCs w:val="18"/>
       </w:rPr>
-      <w:t>18</w:t>
+      <w:t>19</w:t>
     </w:r>
     <w:r>
       <w:rPr>
@@ -17840,10 +18346,10 @@
 <file path=word/numbering.xml><?xml version="1.0" encoding="utf-8"?>
 <w:numbering xmlns:wpc="http://schemas.microsoft.com/office/word/2010/wordprocessingCanvas" xmlns:cx="http://schemas.microsoft.com/office/drawing/2014/chartex" xmlns:cx1="http://schemas.microsoft.com/office/drawing/2015/9/8/chartex" xmlns:cx2="http://schemas.microsoft.com/office/drawing/2015/10/21/chartex" xmlns:cx3="http://schemas.microsoft.com/office/drawing/2016/5/9/chartex" xmlns:cx4="http://schemas.microsoft.com/office/drawing/2016/5/10/chartex" xmlns:cx5="http://schemas.microsoft.com/office/drawing/2016/5/11/chartex" xmlns:cx6="http://schemas.microsoft.com/office/drawing/2016/5/12/chartex" xmlns:cx7="http://schemas.microsoft.com/office/drawing/2016/5/13/chartex" xmlns:cx8="http://schemas.microsoft.com/office/drawing/2016/5/14/chartex" xmlns:mc="http://schemas.openxmlformats.org/markup-compatibility/2006" xmlns:aink="http://schemas.microsoft.com/office/drawing/2016/ink" xmlns:am3d="http://schemas.microsoft.com/office/drawing/2017/model3d" xmlns:o="urn:schemas-microsoft-com:office:office" xmlns:oel="http://schemas.microsoft.com/office/2019/extlst" xmlns:r="http://schemas.openxmlformats.org/officeDocument/2006/relationships" xmlns:m="http://schemas.openxmlformats.org/officeDocument/2006/math" xmlns:v="urn:schemas-microsoft-com:vml" xmlns:wp14="http://schemas.microsoft.com/office/word/2010/wordprocessingDrawing" xmlns:wp="http://schemas.openxmlformats.org/drawingml/2006/wordprocessingDrawing" xmlns:w10="urn:schemas-microsoft-com:office:word" xmlns:w="http://schemas.openxmlformats.org/wordprocessingml/2006/main" xmlns:w14="http://schemas.microsoft.com/office/word/2010/wordml" xmlns:w15="http://schemas.microsoft.com/office/word/2012/wordml" xmlns:w16cex="http://schemas.microsoft.com/office/word/2018/wordml/cex" xmlns:w16cid="http://schemas.microsoft.com/office/word/2016/wordml/cid" xmlns:w16="http://schemas.microsoft.com/office/word/2018/wordml" xmlns:w16du="http://schemas.microsoft.com/office/word/2023/wordml/word16du" xmlns:w16sdtdh="http://schemas.microsoft.com/office/word/2020/wordml/sdtdatahash" xmlns:w16sdtfl="http://schemas.microsoft.com/office/word/2024/wordml/sdtformatlock" xmlns:w16se="http://schemas.microsoft.com/office/word/2015/wordml/symex" xmlns:wpg="http://schemas.microsoft.com/office/word/2010/wordprocessingGroup" xmlns:wpi="http://schemas.microsoft.com/office/word/2010/wordprocessingInk" xmlns:wne="http://schemas.microsoft.com/office/word/2006/wordml" xmlns:wps="http://schemas.microsoft.com/office/word/2010/wordprocessingShape" mc:Ignorable="w14 w15 w16se w16cid w16 w16cex w16sdtdh w16sdtfl w16du wp14">
   <w:abstractNum w:abstractNumId="0" w15:restartNumberingAfterBreak="0">
-    <w:nsid w:val="43A37624"/>
+    <w:nsid w:val="1E886D7A"/>
     <w:multiLevelType w:val="hybridMultilevel"/>
-    <w:tmpl w:val="3A2041F8"/>
-    <w:lvl w:ilvl="0" w:tplc="45148600">
+    <w:tmpl w:val="7AB856DE"/>
+    <w:lvl w:ilvl="0" w:tplc="0F84BFD4">
       <w:start w:val="1"/>
       <w:numFmt w:val="decimal"/>
       <w:lvlText w:val="%1."/>
@@ -17852,52 +18358,52 @@
         <w:ind w:left="567" w:hanging="340"/>
       </w:pPr>
     </w:lvl>
-    <w:lvl w:ilvl="1" w:tplc="2AF2E53A">
+    <w:lvl w:ilvl="1" w:tplc="C2BEA6D0">
       <w:numFmt w:val="decimal"/>
       <w:lvlText w:val=""/>
       <w:lvlJc w:val="left"/>
     </w:lvl>
-    <w:lvl w:ilvl="2" w:tplc="9D487BCE">
+    <w:lvl w:ilvl="2" w:tplc="035889F0">
       <w:numFmt w:val="decimal"/>
       <w:lvlText w:val=""/>
       <w:lvlJc w:val="left"/>
     </w:lvl>
-    <w:lvl w:ilvl="3" w:tplc="F60E422C">
+    <w:lvl w:ilvl="3" w:tplc="43CC70E8">
       <w:numFmt w:val="decimal"/>
       <w:lvlText w:val=""/>
       <w:lvlJc w:val="left"/>
     </w:lvl>
-    <w:lvl w:ilvl="4" w:tplc="F822DD7A">
+    <w:lvl w:ilvl="4" w:tplc="04F8E4D6">
       <w:numFmt w:val="decimal"/>
       <w:lvlText w:val=""/>
       <w:lvlJc w:val="left"/>
     </w:lvl>
-    <w:lvl w:ilvl="5" w:tplc="2C3C642A">
+    <w:lvl w:ilvl="5" w:tplc="A7AC055A">
       <w:numFmt w:val="decimal"/>
       <w:lvlText w:val=""/>
       <w:lvlJc w:val="left"/>
     </w:lvl>
-    <w:lvl w:ilvl="6" w:tplc="30F0F50C">
+    <w:lvl w:ilvl="6" w:tplc="CEEA6BEA">
       <w:numFmt w:val="decimal"/>
       <w:lvlText w:val=""/>
       <w:lvlJc w:val="left"/>
     </w:lvl>
-    <w:lvl w:ilvl="7" w:tplc="81C6054C">
+    <w:lvl w:ilvl="7" w:tplc="4E0220F8">
       <w:numFmt w:val="decimal"/>
       <w:lvlText w:val=""/>
       <w:lvlJc w:val="left"/>
     </w:lvl>
-    <w:lvl w:ilvl="8" w:tplc="B890030C">
+    <w:lvl w:ilvl="8" w:tplc="400432F4">
       <w:numFmt w:val="decimal"/>
       <w:lvlText w:val=""/>
       <w:lvlJc w:val="left"/>
     </w:lvl>
   </w:abstractNum>
   <w:abstractNum w:abstractNumId="1" w15:restartNumberingAfterBreak="0">
-    <w:nsid w:val="4815087C"/>
+    <w:nsid w:val="3BBC6367"/>
     <w:multiLevelType w:val="hybridMultilevel"/>
-    <w:tmpl w:val="E0F8074E"/>
-    <w:lvl w:ilvl="0" w:tplc="8098D494" w:tentative="1">
+    <w:tmpl w:val="6FF0C096"/>
+    <w:lvl w:ilvl="0" w:tplc="C28C10D2" w:tentative="1">
       <w:start w:val="1"/>
       <w:numFmt w:val="bullet"/>
       <w:lvlText w:val="●"/>
@@ -17906,7 +18412,7 @@
         <w:ind w:left="720" w:hanging="360"/>
       </w:pPr>
     </w:lvl>
-    <w:lvl w:ilvl="1" w:tplc="C5609C7A" w:tentative="1">
+    <w:lvl w:ilvl="1" w:tplc="B85AD9F6" w:tentative="1">
       <w:start w:val="1"/>
       <w:numFmt w:val="bullet"/>
       <w:lvlText w:val="○"/>
@@ -17915,7 +18421,7 @@
         <w:ind w:left="1440" w:hanging="360"/>
       </w:pPr>
     </w:lvl>
-    <w:lvl w:ilvl="2" w:tplc="91EA650E" w:tentative="1">
+    <w:lvl w:ilvl="2" w:tplc="5F34A514" w:tentative="1">
       <w:start w:val="1"/>
       <w:numFmt w:val="bullet"/>
       <w:lvlText w:val="■"/>
@@ -17924,7 +18430,7 @@
         <w:ind w:left="2160" w:hanging="360"/>
       </w:pPr>
     </w:lvl>
-    <w:lvl w:ilvl="3" w:tplc="64D822D0" w:tentative="1">
+    <w:lvl w:ilvl="3" w:tplc="6510A23E" w:tentative="1">
       <w:start w:val="1"/>
       <w:numFmt w:val="bullet"/>
       <w:lvlText w:val="●"/>
@@ -17933,7 +18439,7 @@
         <w:ind w:left="2880" w:hanging="360"/>
       </w:pPr>
     </w:lvl>
-    <w:lvl w:ilvl="4" w:tplc="FB40838C" w:tentative="1">
+    <w:lvl w:ilvl="4" w:tplc="90C69796" w:tentative="1">
       <w:start w:val="1"/>
       <w:numFmt w:val="bullet"/>
       <w:lvlText w:val="○"/>
@@ -17942,7 +18448,7 @@
         <w:ind w:left="3600" w:hanging="360"/>
       </w:pPr>
     </w:lvl>
-    <w:lvl w:ilvl="5" w:tplc="FD52EA76" w:tentative="1">
+    <w:lvl w:ilvl="5" w:tplc="F19A2BD0" w:tentative="1">
       <w:start w:val="1"/>
       <w:numFmt w:val="bullet"/>
       <w:lvlText w:val="■"/>
@@ -17951,7 +18457,7 @@
         <w:ind w:left="4320" w:hanging="360"/>
       </w:pPr>
     </w:lvl>
-    <w:lvl w:ilvl="6" w:tplc="658C4284" w:tentative="1">
+    <w:lvl w:ilvl="6" w:tplc="4E28B66A" w:tentative="1">
       <w:start w:val="1"/>
       <w:numFmt w:val="bullet"/>
       <w:lvlText w:val="●"/>
@@ -17960,7 +18466,7 @@
         <w:ind w:left="5040" w:hanging="360"/>
       </w:pPr>
     </w:lvl>
-    <w:lvl w:ilvl="7" w:tplc="3A682DFA" w:tentative="1">
+    <w:lvl w:ilvl="7" w:tplc="6EA4F92E" w:tentative="1">
       <w:start w:val="1"/>
       <w:numFmt w:val="bullet"/>
       <w:lvlText w:val="●"/>
@@ -17969,7 +18475,7 @@
         <w:ind w:left="5760" w:hanging="360"/>
       </w:pPr>
     </w:lvl>
-    <w:lvl w:ilvl="8" w:tplc="5712DA94" w:tentative="1">
+    <w:lvl w:ilvl="8" w:tplc="016CDDB0" w:tentative="1">
       <w:start w:val="1"/>
       <w:numFmt w:val="bullet"/>
       <w:lvlText w:val="●"/>
@@ -17980,10 +18486,10 @@
     </w:lvl>
   </w:abstractNum>
   <w:abstractNum w:abstractNumId="2" w15:restartNumberingAfterBreak="0">
-    <w:nsid w:val="49020FD3"/>
+    <w:nsid w:val="484B2DC1"/>
     <w:multiLevelType w:val="hybridMultilevel"/>
-    <w:tmpl w:val="6E3431AE"/>
-    <w:lvl w:ilvl="0" w:tplc="41E4473E">
+    <w:tmpl w:val="10307D42"/>
+    <w:lvl w:ilvl="0" w:tplc="D3446FC0">
       <w:start w:val="1"/>
       <w:numFmt w:val="bullet"/>
       <w:lvlText w:val="•"/>
@@ -17992,60 +18498,60 @@
         <w:ind w:left="567" w:hanging="283"/>
       </w:pPr>
     </w:lvl>
-    <w:lvl w:ilvl="1" w:tplc="9752A176">
+    <w:lvl w:ilvl="1" w:tplc="8224077C">
       <w:numFmt w:val="decimal"/>
       <w:lvlText w:val=""/>
       <w:lvlJc w:val="left"/>
     </w:lvl>
-    <w:lvl w:ilvl="2" w:tplc="C074AA74">
+    <w:lvl w:ilvl="2" w:tplc="9ECA31A4">
       <w:numFmt w:val="decimal"/>
       <w:lvlText w:val=""/>
       <w:lvlJc w:val="left"/>
     </w:lvl>
-    <w:lvl w:ilvl="3" w:tplc="9006B952">
+    <w:lvl w:ilvl="3" w:tplc="DA3476A4">
       <w:numFmt w:val="decimal"/>
       <w:lvlText w:val=""/>
       <w:lvlJc w:val="left"/>
     </w:lvl>
-    <w:lvl w:ilvl="4" w:tplc="01D6E570">
+    <w:lvl w:ilvl="4" w:tplc="1608B2BE">
       <w:numFmt w:val="decimal"/>
       <w:lvlText w:val=""/>
       <w:lvlJc w:val="left"/>
     </w:lvl>
-    <w:lvl w:ilvl="5" w:tplc="9F8C5930">
+    <w:lvl w:ilvl="5" w:tplc="A3F0D7D6">
       <w:numFmt w:val="decimal"/>
       <w:lvlText w:val=""/>
       <w:lvlJc w:val="left"/>
     </w:lvl>
-    <w:lvl w:ilvl="6" w:tplc="DAAA5228">
+    <w:lvl w:ilvl="6" w:tplc="CCE4C08C">
       <w:numFmt w:val="decimal"/>
       <w:lvlText w:val=""/>
       <w:lvlJc w:val="left"/>
     </w:lvl>
-    <w:lvl w:ilvl="7" w:tplc="26D0430A">
+    <w:lvl w:ilvl="7" w:tplc="71F66AFE">
       <w:numFmt w:val="decimal"/>
       <w:lvlText w:val=""/>
       <w:lvlJc w:val="left"/>
     </w:lvl>
-    <w:lvl w:ilvl="8" w:tplc="507AC79C">
+    <w:lvl w:ilvl="8" w:tplc="FC480CD2">
       <w:numFmt w:val="decimal"/>
       <w:lvlText w:val=""/>
       <w:lvlJc w:val="left"/>
     </w:lvl>
   </w:abstractNum>
-  <w:num w:numId="1" w16cid:durableId="526677004">
+  <w:num w:numId="1" w16cid:durableId="1975022614">
     <w:abstractNumId w:val="1"/>
     <w:lvlOverride w:ilvl="0">
       <w:startOverride w:val="1"/>
     </w:lvlOverride>
   </w:num>
-  <w:num w:numId="2" w16cid:durableId="1456019945">
+  <w:num w:numId="2" w16cid:durableId="1415737477">
     <w:abstractNumId w:val="0"/>
     <w:lvlOverride w:ilvl="0">
       <w:startOverride w:val="1"/>
     </w:lvlOverride>
   </w:num>
-  <w:num w:numId="3" w16cid:durableId="1133132419">
+  <w:num w:numId="3" w16cid:durableId="883105852">
     <w:abstractNumId w:val="2"/>
     <w:lvlOverride w:ilvl="0">
       <w:startOverride w:val="1"/>
@@ -18491,7 +18997,6 @@
     <w:basedOn w:val="Normal"/>
     <w:next w:val="Normal"/>
     <w:uiPriority w:val="9"/>
-    <w:semiHidden/>
     <w:unhideWhenUsed/>
     <w:qFormat/>
     <w:pPr>

</xml_diff>